<commit_message>
Adiciona a seção de Modelagem ao relatório
Deriva 2n = k(2a+k-1) a partir da soma de k termos consecutivos, mostra
que k e (2a+k-1) sempre têm paridades opostas, e conclui que a
quantidade de decomposições de n é igual à quantidade de divisores
ímpares de n. Confere com o exemplo do enunciado (15 → 4).

Co-Authored-By: Claude Sonnet 5 <noreply@anthropic.com>
</commit_message>
<xml_diff>
--- a/Trabalho1/relatorio-trabalho1.docx
+++ b/Trabalho1/relatorio-trabalho1.docx
@@ -26,27 +26,25 @@
         <w:t>Algoritmos e Estruturas de Dados II</w:t>
       </w:r>
     </w:p>
-    <w:p/>
-    <w:p/>
-    <w:p/>
-    <w:p/>
-    <w:p/>
-    <w:p/>
     <w:p>
       <w:pPr>
         <w:jc w:val="center"/>
       </w:pPr>
       <w:r>
+        <w:t>Turma 320</w:t>
+      </w:r>
+    </w:p>
+    <w:p/>
+    <w:p/>
+    <w:p/>
+    <w:p>
+      <w:pPr>
+        <w:jc w:val="center"/>
+      </w:pPr>
+      <w:r>
         <w:t>Guilherme Guimarães Santos</w:t>
       </w:r>
     </w:p>
-    <w:p/>
-    <w:p/>
-    <w:p/>
-    <w:p/>
-    <w:p/>
-    <w:p/>
-    <w:p/>
     <w:p/>
     <w:p/>
     <w:p/>
@@ -59,9 +57,11 @@
           <w:b/>
           <w:sz w:val="32"/>
         </w:rPr>
-        <w:t>TRABALHO 1 — NÚMEROS DECOMPOSTOS</w:t>
-      </w:r>
-    </w:p>
+        <w:t xml:space="preserve">TRABALHO 1 - NÚMEROS DECOMPOSTOS</w:t>
+      </w:r>
+    </w:p>
+    <w:p/>
+    <w:p/>
     <w:p/>
     <w:p/>
     <w:p/>
@@ -77,106 +77,164 @@
         <w:t>Relatório apresentado à disciplina de Algoritmos e Estruturas de Dados II, da Escola Politécnica da Pontifícia Universidade Católica do Rio Grande do Sul (PUCRS), como requisito do Trabalho 1, sob orientação do professor João Batista Souza de Oliveira.</w:t>
       </w:r>
     </w:p>
-    <w:p>
-      <w:pPr>
-        <w:ind w:left="4536"/>
-      </w:pPr>
+    <w:p/>
+    <w:p/>
+    <w:p/>
+    <w:p/>
+    <w:p/>
+    <w:p>
+      <w:pPr>
+        <w:jc w:val="center"/>
+      </w:pPr>
+      <w:r>
+        <w:t>Porto Alegre</w:t>
+      </w:r>
+    </w:p>
+    <w:p>
+      <w:pPr>
+        <w:jc w:val="center"/>
+      </w:pPr>
+      <w:r>
+        <w:t>09 de setembro de 2026</w:t>
+      </w:r>
+    </w:p>
+    <w:p>
+      <w:pPr>
+        <w:pStyle w:val="Ttulo1"/>
+      </w:pPr>
+      <w:r>
+        <w:lastRenderedPageBreak/>
+        <w:t>1. Introdução</w:t>
+      </w:r>
+    </w:p>
+    <w:p>
+      <w:r>
+        <w:t>O problema tratado neste trabalho é encontrar decomposições de números inteiros. Uma decomposição de um número n é uma sequência de inteiros positivos e consecutivos cuja soma é igual a n. Por exemplo, o número 15 tem quatro decomposições diferentes:</w:t>
+      </w:r>
+    </w:p>
+    <w:p>
+      <w:pPr>
+        <w:ind w:left="720"/>
+      </w:pPr>
+      <w:r>
+        <w:t>15 = 1 + 2 + 3 + 4 + 5</w:t>
+      </w:r>
+    </w:p>
+    <w:p>
+      <w:pPr>
+        <w:ind w:left="720"/>
+      </w:pPr>
+      <w:r>
+        <w:t>15 = 4 + 5 + 6</w:t>
+      </w:r>
+    </w:p>
+    <w:p>
+      <w:pPr>
+        <w:ind w:left="720"/>
+      </w:pPr>
+      <w:r>
+        <w:t>15 = 7 + 8</w:t>
+      </w:r>
+    </w:p>
+    <w:p>
+      <w:pPr>
+        <w:ind w:left="720"/>
+      </w:pPr>
+      <w:r>
+        <w:t>15 = 15</w:t>
+      </w:r>
+    </w:p>
+    <w:p>
+      <w:r>
+        <w:t>O objetivo deste trabalho é, para sete faixas de números entre 2 e 2.000.000, descobrir qual ou quais números possuem a maior quantidade de decomposições. O enunciado exige que a solução seja implementada de forma recursiva.</w:t>
+      </w:r>
+    </w:p>
+    <w:p>
+      <w:r>
+        <w:t>Ao estudar o problema, percebemos que a quantidade de decomposições de um número está relacionada à quantidade de divisores ímpares desse número. Essa relação foi essencial para chegar a uma solução eficiente e é explicada na próxima seção.</w:t>
+      </w:r>
+    </w:p>
+    <w:p>
+      <w:r>
+        <w:t>Este relatório está organizado da seguinte forma: a Seção 2 mostra como o problema foi modelado; a Seção 3 apresenta o algoritmo utilizado, incluindo uma versão inicial mais simples que foi descartada; a Seção 4 analisa a eficiência das duas versões; a Seção 5 mostra os resultados obtidos para as sete faixas pedidas; e a Seção 6 traz as conclusões.</w:t>
+      </w:r>
+    </w:p>
+    <w:p>
+      <w:pPr>
+        <w:pStyle w:val="Ttulo1"/>
+      </w:pPr>
+      <w:r>
+        <w:t>2. Modelagem</w:t>
+      </w:r>
+    </w:p>
+    <w:p>
+      <w:r>
+        <w:t>Uma decomposição de n em k termos consecutivos começando em a pode ser escrita como:</w:t>
+      </w:r>
+    </w:p>
+    <w:p>
+      <w:pPr>
+        <w:ind w:left="720"/>
+      </w:pPr>
+      <w:r>
+        <w:t>n = a + (a+1) + (a+2) + ... + (a+k-1)</w:t>
+      </w:r>
+    </w:p>
+    <w:p>
+      <w:r>
+        <w:t>Como são k termos, essa soma é igual a:</w:t>
+      </w:r>
+    </w:p>
+    <w:p>
+      <w:pPr>
+        <w:ind w:left="720"/>
+      </w:pPr>
+      <w:r>
+        <w:t>n = k·a + k(k-1)/2</w:t>
+      </w:r>
+    </w:p>
+    <w:p>
+      <w:r>
+        <w:t>Multiplicando os dois lados por 2:</w:t>
+      </w:r>
+    </w:p>
+    <w:p>
+      <w:pPr>
+        <w:ind w:left="720"/>
+      </w:pPr>
+      <w:r>
+        <w:t>2n = k · (2a + k - 1)</w:t>
+      </w:r>
+    </w:p>
+    <w:p>
+      <w:r>
+        <w:t>Ou seja, achar uma decomposição de n é o mesmo que achar uma forma de escrever 2n como o produto de dois números, k e (2a+k-1). A diferença entre esses dois números, (2a+k-1) − k = 2a−1, é sempre ímpar — o que significa que, dos dois, um é sempre par e o outro sempre ímpar.</w:t>
+      </w:r>
+    </w:p>
+    <w:p>
+      <w:r>
+        <w:t>O fator ímpar dessa dupla é, então, um divisor ímpar de 2n. E os divisores ímpares de 2n são exatamente os divisores ímpares de n, já que multiplicar por 2 não cria nem elimina divisores ímpares. Ou seja: cada divisor ímpar de n dá origem a uma decomposição.</w:t>
+      </w:r>
+    </w:p>
+    <w:p>
+      <w:r>
+        <w:t xml:space="preserve">Concluindo: </w:t>
+      </w:r>
       <w:r>
         <w:rPr>
-          <w:sz w:val="22"/>
+          <w:b/>
         </w:rPr>
-        <w:t>Turma 320</w:t>
-      </w:r>
-    </w:p>
-    <w:p/>
-    <w:p/>
-    <w:p/>
-    <w:p/>
-    <w:p/>
-    <w:p/>
-    <w:p/>
-    <w:p/>
-    <w:p/>
-    <w:p/>
-    <w:p>
-      <w:pPr>
-        <w:jc w:val="center"/>
-      </w:pPr>
-      <w:r>
-        <w:t>Porto Alegre</w:t>
-      </w:r>
-    </w:p>
-    <w:p>
-      <w:pPr>
-        <w:jc w:val="center"/>
-      </w:pPr>
-      <w:r>
-        <w:t>09 de setembro de 2026</w:t>
-      </w:r>
-    </w:p>
-    <w:p>
-      <w:r>
-        <w:br w:type="page"/>
-      </w:r>
-    </w:p>
-    <w:p>
-      <w:pPr>
-        <w:pStyle w:val="Ttulo1"/>
-      </w:pPr>
-      <w:r>
-        <w:t>1. Introdução</w:t>
-      </w:r>
-    </w:p>
-    <w:p>
-      <w:r>
-        <w:t>O problema tratado neste trabalho é encontrar decomposições de números inteiros. Uma decomposição de um número n é uma sequência de inteiros positivos e consecutivos cuja soma é igual a n. Por exemplo, o número 15 tem quatro decomposições diferentes:</w:t>
-      </w:r>
-    </w:p>
-    <w:p>
-      <w:pPr>
-        <w:ind w:left="720"/>
-      </w:pPr>
-      <w:r>
-        <w:t>15 = 1 + 2 + 3 + 4 + 5</w:t>
-      </w:r>
-    </w:p>
-    <w:p>
-      <w:pPr>
-        <w:ind w:left="720"/>
-      </w:pPr>
-      <w:r>
-        <w:t>15 = 4 + 5 + 6</w:t>
-      </w:r>
-    </w:p>
-    <w:p>
-      <w:pPr>
-        <w:ind w:left="720"/>
-      </w:pPr>
-      <w:r>
-        <w:t>15 = 7 + 8</w:t>
-      </w:r>
-    </w:p>
-    <w:p>
-      <w:pPr>
-        <w:ind w:left="720"/>
-      </w:pPr>
-      <w:r>
-        <w:t>15 = 15</w:t>
-      </w:r>
-    </w:p>
-    <w:p>
-      <w:r>
-        <w:t>O objetivo deste trabalho é, para sete faixas de números entre 2 e 2.000.000, descobrir qual ou quais números possuem a maior quantidade de decomposições. O enunciado exige que a solução seja implementada de forma recursiva.</w:t>
-      </w:r>
-    </w:p>
-    <w:p>
-      <w:r>
-        <w:t>Ao estudar o problema, percebemos que a quantidade de decomposições de um número está relacionada à quantidade de divisores ímpares desse número. Essa relação foi essencial para chegar a uma solução eficiente e é explicada na próxima seção.</w:t>
-      </w:r>
-    </w:p>
-    <w:p>
-      <w:r>
-        <w:t>Este relatório está organizado da seguinte forma: a Seção 2 mostra como o problema foi modelado; a Seção 3 apresenta o algoritmo utilizado, incluindo uma versão inicial mais simples que foi descartada; a Seção 4 analisa a eficiência das duas versões; a Seção 5 mostra os resultados obtidos para as sete faixas pedidas; e a Seção 6 traz as conclusões.</w:t>
+        <w:t>a quantidade de decomposições de n é igual à quantidade de divisores ímpares de n.</w:t>
+      </w:r>
+    </w:p>
+    <w:p>
+      <w:r>
+        <w:t>Isso pode ser conferido no próprio exemplo do enunciado: 15 = 3 × 5, e seus divisores são 1, 3, 5 e 15 — todos ímpares, já que 15 é ímpar. São 4 divisores, o mesmo número de decomposições mostrado no enunciado.</w:t>
+      </w:r>
+    </w:p>
+    <w:p>
+      <w:r>
+        <w:t>Essa relação foi a base da solução: em vez de testar sequências de números consecutivos, o algoritmo conta os divisores ímpares de cada número.</w:t>
       </w:r>
     </w:p>
     <w:sectPr>

</xml_diff>

<commit_message>
Adiciona a seção de Algoritmo e ajusta formatação do relatório
Seção 3 (versão inicial descartada + versão final, pseudocódigo em
Courier New, exemplo passo a passo para n=15 em tabela). Ajustes de
formatação: fonte do documento trocada para Times New Roman (conforme
o próprio exemplo do professor pede), espaço antes do texto que segue
a tabela, e tabelas configuradas para não quebrar entre páginas e
centralizar o conteúdo das células na horizontal e na vertical.

Co-Authored-By: Claude Sonnet 5 <noreply@anthropic.com>
</commit_message>
<xml_diff>
--- a/Trabalho1/relatorio-trabalho1.docx
+++ b/Trabalho1/relatorio-trabalho1.docx
@@ -57,7 +57,7 @@
           <w:b/>
           <w:sz w:val="32"/>
         </w:rPr>
-        <w:t xml:space="preserve">TRABALHO 1 - NÚMEROS DECOMPOSTOS</w:t>
+        <w:t>TRABALHO 1 - NÚMEROS DECOMPOSTOS</w:t>
       </w:r>
     </w:p>
     <w:p/>
@@ -213,7 +213,11 @@
     </w:p>
     <w:p>
       <w:r>
-        <w:t>O fator ímpar dessa dupla é, então, um divisor ímpar de 2n. E os divisores ímpares de 2n são exatamente os divisores ímpares de n, já que multiplicar por 2 não cria nem elimina divisores ímpares. Ou seja: cada divisor ímpar de n dá origem a uma decomposição.</w:t>
+        <w:t xml:space="preserve">O fator ímpar dessa dupla é, então, um divisor ímpar de 2n. E os divisores ímpares de 2n são exatamente os divisores ímpares de n, já que multiplicar por 2 não cria nem </w:t>
+      </w:r>
+      <w:r>
+        <w:lastRenderedPageBreak/>
+        <w:t>elimina divisores ímpares. Ou seja: cada divisor ímpar de n dá origem a uma decomposição.</w:t>
       </w:r>
     </w:p>
     <w:p>
@@ -235,6 +239,991 @@
     <w:p>
       <w:r>
         <w:t>Essa relação foi a base da solução: em vez de testar sequências de números consecutivos, o algoritmo conta os divisores ímpares de cada número.</w:t>
+      </w:r>
+    </w:p>
+    <w:p>
+      <w:pPr>
+        <w:pStyle w:val="Ttulo1"/>
+      </w:pPr>
+      <w:r>
+        <w:t>3. Algoritmo</w:t>
+      </w:r>
+    </w:p>
+    <w:p>
+      <w:pPr>
+        <w:pStyle w:val="Ttulo2"/>
+      </w:pPr>
+      <w:r>
+        <w:t>3.1 Versão inicial</w:t>
+      </w:r>
+    </w:p>
+    <w:p>
+      <w:r>
+        <w:t>A primeira ideia foi bem direta: para cada n, testar cada possível ponto de partida de 1 até n, e para cada um ir somando os próximos termos até alcançar ou ultrapassar n.</w:t>
+      </w:r>
+    </w:p>
+    <w:p>
+      <w:pPr>
+        <w:ind w:left="720"/>
+      </w:pPr>
+      <w:r>
+        <w:rPr>
+          <w:rFonts w:ascii="Courier New" w:hAnsi="Courier New" w:cs="Courier New"/>
+        </w:rPr>
+        <w:t>função contarIngenuo(n):</w:t>
+      </w:r>
+    </w:p>
+    <w:p>
+      <w:pPr>
+        <w:ind w:left="720"/>
+      </w:pPr>
+      <w:r>
+        <w:rPr>
+          <w:rFonts w:ascii="Courier New" w:hAnsi="Courier New" w:cs="Courier New"/>
+        </w:rPr>
+        <w:t xml:space="preserve">    retorna contarComecosPossiveis(n, 1)</w:t>
+      </w:r>
+    </w:p>
+    <w:p>
+      <w:pPr>
+        <w:ind w:left="720"/>
+      </w:pPr>
+    </w:p>
+    <w:p>
+      <w:pPr>
+        <w:ind w:left="720"/>
+      </w:pPr>
+      <w:r>
+        <w:rPr>
+          <w:rFonts w:ascii="Courier New" w:hAnsi="Courier New" w:cs="Courier New"/>
+        </w:rPr>
+        <w:t>função contarComecosPossiveis(n, inicio):</w:t>
+      </w:r>
+    </w:p>
+    <w:p>
+      <w:pPr>
+        <w:ind w:left="720"/>
+      </w:pPr>
+      <w:r>
+        <w:rPr>
+          <w:rFonts w:ascii="Courier New" w:hAnsi="Courier New" w:cs="Courier New"/>
+        </w:rPr>
+        <w:t xml:space="preserve">    se inicio &gt; n:</w:t>
+      </w:r>
+    </w:p>
+    <w:p>
+      <w:pPr>
+        <w:ind w:left="720"/>
+      </w:pPr>
+      <w:r>
+        <w:rPr>
+          <w:rFonts w:ascii="Courier New" w:hAnsi="Courier New" w:cs="Courier New"/>
+        </w:rPr>
+        <w:t xml:space="preserve">        retorna 0</w:t>
+      </w:r>
+    </w:p>
+    <w:p>
+      <w:pPr>
+        <w:ind w:left="720"/>
+      </w:pPr>
+      <w:r>
+        <w:rPr>
+          <w:rFonts w:ascii="Courier New" w:hAnsi="Courier New" w:cs="Courier New"/>
+        </w:rPr>
+        <w:t xml:space="preserve">    se alcancaSoma(n, inicio, inicio, inicio):</w:t>
+      </w:r>
+    </w:p>
+    <w:p>
+      <w:pPr>
+        <w:ind w:left="720"/>
+      </w:pPr>
+      <w:r>
+        <w:rPr>
+          <w:rFonts w:ascii="Courier New" w:hAnsi="Courier New" w:cs="Courier New"/>
+        </w:rPr>
+        <w:t xml:space="preserve">        valido = 1</w:t>
+      </w:r>
+    </w:p>
+    <w:p>
+      <w:pPr>
+        <w:ind w:left="720"/>
+      </w:pPr>
+      <w:r>
+        <w:rPr>
+          <w:rFonts w:ascii="Courier New" w:hAnsi="Courier New" w:cs="Courier New"/>
+        </w:rPr>
+        <w:t xml:space="preserve">    senão:</w:t>
+      </w:r>
+    </w:p>
+    <w:p>
+      <w:pPr>
+        <w:ind w:left="720"/>
+      </w:pPr>
+      <w:r>
+        <w:rPr>
+          <w:rFonts w:ascii="Courier New" w:hAnsi="Courier New" w:cs="Courier New"/>
+        </w:rPr>
+        <w:t xml:space="preserve">        valido = 0</w:t>
+      </w:r>
+    </w:p>
+    <w:p>
+      <w:pPr>
+        <w:ind w:left="720"/>
+      </w:pPr>
+      <w:r>
+        <w:rPr>
+          <w:rFonts w:ascii="Courier New" w:hAnsi="Courier New" w:cs="Courier New"/>
+        </w:rPr>
+        <w:t xml:space="preserve">    retorna valido + contarComecosPossiveis(n, inicio + 1)</w:t>
+      </w:r>
+    </w:p>
+    <w:p>
+      <w:pPr>
+        <w:ind w:left="720"/>
+      </w:pPr>
+    </w:p>
+    <w:p>
+      <w:pPr>
+        <w:ind w:left="720"/>
+      </w:pPr>
+      <w:r>
+        <w:rPr>
+          <w:rFonts w:ascii="Courier New" w:hAnsi="Courier New" w:cs="Courier New"/>
+        </w:rPr>
+        <w:t>função alcancaSoma(n, inicio, atual, soma):</w:t>
+      </w:r>
+    </w:p>
+    <w:p>
+      <w:pPr>
+        <w:ind w:left="720"/>
+      </w:pPr>
+      <w:r>
+        <w:rPr>
+          <w:rFonts w:ascii="Courier New" w:hAnsi="Courier New" w:cs="Courier New"/>
+        </w:rPr>
+        <w:t xml:space="preserve">    se soma == n:</w:t>
+      </w:r>
+    </w:p>
+    <w:p>
+      <w:pPr>
+        <w:ind w:left="720"/>
+      </w:pPr>
+      <w:r>
+        <w:rPr>
+          <w:rFonts w:ascii="Courier New" w:hAnsi="Courier New" w:cs="Courier New"/>
+        </w:rPr>
+        <w:t xml:space="preserve">        retorna verdadeiro</w:t>
+      </w:r>
+    </w:p>
+    <w:p>
+      <w:pPr>
+        <w:ind w:left="720"/>
+      </w:pPr>
+      <w:r>
+        <w:rPr>
+          <w:rFonts w:ascii="Courier New" w:hAnsi="Courier New" w:cs="Courier New"/>
+        </w:rPr>
+        <w:t xml:space="preserve">    se soma &gt; n:</w:t>
+      </w:r>
+    </w:p>
+    <w:p>
+      <w:pPr>
+        <w:ind w:left="720"/>
+      </w:pPr>
+      <w:r>
+        <w:rPr>
+          <w:rFonts w:ascii="Courier New" w:hAnsi="Courier New" w:cs="Courier New"/>
+        </w:rPr>
+        <w:t xml:space="preserve">        retorna falso</w:t>
+      </w:r>
+    </w:p>
+    <w:p>
+      <w:pPr>
+        <w:ind w:left="720"/>
+      </w:pPr>
+      <w:r>
+        <w:rPr>
+          <w:rFonts w:ascii="Courier New" w:hAnsi="Courier New" w:cs="Courier New"/>
+        </w:rPr>
+        <w:lastRenderedPageBreak/>
+        <w:t xml:space="preserve">    retorna alcancaSoma(n, inicio, atual + 1, soma + atual + 1)</w:t>
+      </w:r>
+    </w:p>
+    <w:p>
+      <w:r>
+        <w:t>Essa versão funciona, mas é lenta: para cada n, testa até n pontos de partida diferentes, e cada um deles soma termo a termo. Além de lenta, a recursão tem profundidade proporcional a n (uma chamada de contarComecosPossiveis para cada ponto de partida testado), e na prática isso estoura a pilha de execução para n a partir de aproximadamente 64 mil. Por esses dois motivos essa versão foi descartada; os tempos medidos com ela são usados só como comparação na Seção 4.</w:t>
+      </w:r>
+    </w:p>
+    <w:p>
+      <w:pPr>
+        <w:pStyle w:val="Ttulo2"/>
+      </w:pPr>
+      <w:r>
+        <w:t>3.2 Versão final</w:t>
+      </w:r>
+    </w:p>
+    <w:p>
+      <w:r>
+        <w:t>A versão usada de fato se apoia diretamente na relação mostrada na Seção 2: em vez de testar pontos de partida, percorremos os tamanhos de sequência k = 1, 2, 3, ..., enquanto a menor soma possível para aquele k (1+2+...+k) ainda couber em n.</w:t>
+      </w:r>
+    </w:p>
+    <w:p>
+      <w:pPr>
+        <w:ind w:left="720"/>
+      </w:pPr>
+      <w:r>
+        <w:rPr>
+          <w:rFonts w:ascii="Courier New" w:hAnsi="Courier New" w:cs="Courier New"/>
+        </w:rPr>
+        <w:t>função contarDecomposicoes(n):</w:t>
+      </w:r>
+    </w:p>
+    <w:p>
+      <w:pPr>
+        <w:ind w:left="720"/>
+      </w:pPr>
+      <w:r>
+        <w:rPr>
+          <w:rFonts w:ascii="Courier New" w:hAnsi="Courier New" w:cs="Courier New"/>
+        </w:rPr>
+        <w:t xml:space="preserve">    retorna contar(n, 1)</w:t>
+      </w:r>
+    </w:p>
+    <w:p>
+      <w:pPr>
+        <w:ind w:left="720"/>
+      </w:pPr>
+    </w:p>
+    <w:p>
+      <w:pPr>
+        <w:ind w:left="720"/>
+      </w:pPr>
+      <w:r>
+        <w:rPr>
+          <w:rFonts w:ascii="Courier New" w:hAnsi="Courier New" w:cs="Courier New"/>
+        </w:rPr>
+        <w:t>função contar(n, k):</w:t>
+      </w:r>
+    </w:p>
+    <w:p>
+      <w:pPr>
+        <w:ind w:left="720"/>
+      </w:pPr>
+      <w:r>
+        <w:rPr>
+          <w:rFonts w:ascii="Courier New" w:hAnsi="Courier New" w:cs="Courier New"/>
+        </w:rPr>
+        <w:t xml:space="preserve">    menorSoma = k(k+1)/2</w:t>
+      </w:r>
+    </w:p>
+    <w:p>
+      <w:pPr>
+        <w:ind w:left="720"/>
+      </w:pPr>
+      <w:r>
+        <w:rPr>
+          <w:rFonts w:ascii="Courier New" w:hAnsi="Courier New" w:cs="Courier New"/>
+        </w:rPr>
+        <w:t xml:space="preserve">    se menorSoma &gt; n:</w:t>
+      </w:r>
+    </w:p>
+    <w:p>
+      <w:pPr>
+        <w:ind w:left="720"/>
+      </w:pPr>
+      <w:r>
+        <w:rPr>
+          <w:rFonts w:ascii="Courier New" w:hAnsi="Courier New" w:cs="Courier New"/>
+        </w:rPr>
+        <w:t xml:space="preserve">        retorna 0</w:t>
+      </w:r>
+    </w:p>
+    <w:p>
+      <w:pPr>
+        <w:ind w:left="720"/>
+      </w:pPr>
+      <w:r>
+        <w:rPr>
+          <w:rFonts w:ascii="Courier New" w:hAnsi="Courier New" w:cs="Courier New"/>
+        </w:rPr>
+        <w:t xml:space="preserve">    resto = n - k(k-1)/2</w:t>
+      </w:r>
+    </w:p>
+    <w:p>
+      <w:pPr>
+        <w:ind w:left="720"/>
+      </w:pPr>
+      <w:r>
+        <w:rPr>
+          <w:rFonts w:ascii="Courier New" w:hAnsi="Courier New" w:cs="Courier New"/>
+        </w:rPr>
+        <w:t xml:space="preserve">    se resto mod k == 0:</w:t>
+      </w:r>
+    </w:p>
+    <w:p>
+      <w:pPr>
+        <w:ind w:left="720"/>
+      </w:pPr>
+      <w:r>
+        <w:rPr>
+          <w:rFonts w:ascii="Courier New" w:hAnsi="Courier New" w:cs="Courier New"/>
+        </w:rPr>
+        <w:t xml:space="preserve">        valido = 1</w:t>
+      </w:r>
+    </w:p>
+    <w:p>
+      <w:pPr>
+        <w:ind w:left="720"/>
+      </w:pPr>
+      <w:r>
+        <w:rPr>
+          <w:rFonts w:ascii="Courier New" w:hAnsi="Courier New" w:cs="Courier New"/>
+        </w:rPr>
+        <w:t xml:space="preserve">    senão:</w:t>
+      </w:r>
+    </w:p>
+    <w:p>
+      <w:pPr>
+        <w:ind w:left="720"/>
+      </w:pPr>
+      <w:r>
+        <w:rPr>
+          <w:rFonts w:ascii="Courier New" w:hAnsi="Courier New" w:cs="Courier New"/>
+        </w:rPr>
+        <w:t xml:space="preserve">        valido = 0</w:t>
+      </w:r>
+    </w:p>
+    <w:p>
+      <w:pPr>
+        <w:ind w:left="720"/>
+      </w:pPr>
+      <w:r>
+        <w:rPr>
+          <w:rFonts w:ascii="Courier New" w:hAnsi="Courier New" w:cs="Courier New"/>
+        </w:rPr>
+        <w:t xml:space="preserve">    retorna valido + contar(n, k + 1)</w:t>
+      </w:r>
+    </w:p>
+    <w:p>
+      <w:r>
+        <w:t>Para cada k, existe no máximo uma sequência de k termos consecutivos que soma n (a que começa em a = resto/k), então basta checar se esse a é um inteiro. Como k só precisa crescer até menorSoma ultrapassar n, a profundidade da recursão é proporcional a √n — bem menor que a versão anterior.</w:t>
+      </w:r>
+    </w:p>
+    <w:p>
+      <w:r>
+        <w:t>Exemplo de funcionamento, para n = 15:</w:t>
+      </w:r>
+    </w:p>
+    <w:p>
+      <w:pPr>
+        <w:keepNext/>
+        <w:jc w:val="center"/>
+      </w:pPr>
+      <w:r>
+        <w:rPr>
+          <w:i/>
+          <w:sz w:val="20"/>
+        </w:rPr>
+        <w:t>Tabela 1 – Execução do algoritmo para n = 15</w:t>
+      </w:r>
+    </w:p>
+    <w:tbl>
+      <w:tblPr>
+        <w:tblStyle w:val="Tabelanormal"/>
+        <w:tblW w:w="8504" w:type="dxa"/>
+        <w:tblBorders>
+          <w:top w:val="single" w:sz="4" w:space="0" w:color="auto"/>
+          <w:left w:val="single" w:sz="4" w:space="0" w:color="auto"/>
+          <w:bottom w:val="single" w:sz="4" w:space="0" w:color="auto"/>
+          <w:right w:val="single" w:sz="4" w:space="0" w:color="auto"/>
+          <w:insideH w:val="single" w:sz="4" w:space="0" w:color="auto"/>
+          <w:insideV w:val="single" w:sz="4" w:space="0" w:color="auto"/>
+        </w:tblBorders>
+      </w:tblPr>
+      <w:tblGrid>
+        <w:gridCol w:w="800"/>
+        <w:gridCol w:w="2200"/>
+        <w:gridCol w:w="2400"/>
+        <w:gridCol w:w="1500"/>
+        <w:gridCol w:w="1604"/>
+      </w:tblGrid>
+      <w:tr>
+        <w:trPr>
+          <w:cantSplit/>
+        </w:trPr>
+        <w:tc>
+          <w:tcPr>
+            <w:tcW w:w="800" w:type="dxa"/>
+            <w:vAlign w:val="center"/>
+          </w:tcPr>
+          <w:p>
+            <w:pPr>
+              <w:keepNext/>
+              <w:jc w:val="center"/>
+            </w:pPr>
+            <w:r>
+              <w:rPr>
+                <w:b/>
+              </w:rPr>
+              <w:t>k</w:t>
+            </w:r>
+          </w:p>
+        </w:tc>
+        <w:tc>
+          <w:tcPr>
+            <w:tcW w:w="2200" w:type="dxa"/>
+            <w:vAlign w:val="center"/>
+          </w:tcPr>
+          <w:p>
+            <w:pPr>
+              <w:keepNext/>
+              <w:jc w:val="center"/>
+            </w:pPr>
+            <w:r>
+              <w:rPr>
+                <w:b/>
+              </w:rPr>
+              <w:t>menorSoma (≤15?)</w:t>
+            </w:r>
+          </w:p>
+        </w:tc>
+        <w:tc>
+          <w:tcPr>
+            <w:tcW w:w="2400" w:type="dxa"/>
+            <w:vAlign w:val="center"/>
+          </w:tcPr>
+          <w:p>
+            <w:pPr>
+              <w:keepNext/>
+              <w:jc w:val="center"/>
+            </w:pPr>
+            <w:r>
+              <w:rPr>
+                <w:b/>
+              </w:rPr>
+              <w:t>resto = n − k(k−1)/2</w:t>
+            </w:r>
+          </w:p>
+        </w:tc>
+        <w:tc>
+          <w:tcPr>
+            <w:tcW w:w="1500" w:type="dxa"/>
+            <w:vAlign w:val="center"/>
+          </w:tcPr>
+          <w:p>
+            <w:pPr>
+              <w:keepNext/>
+              <w:jc w:val="center"/>
+            </w:pPr>
+            <w:r>
+              <w:rPr>
+                <w:b/>
+              </w:rPr>
+              <w:t>resto mod k</w:t>
+            </w:r>
+          </w:p>
+        </w:tc>
+        <w:tc>
+          <w:tcPr>
+            <w:tcW w:w="1604" w:type="dxa"/>
+            <w:vAlign w:val="center"/>
+          </w:tcPr>
+          <w:p>
+            <w:pPr>
+              <w:keepNext/>
+              <w:jc w:val="center"/>
+            </w:pPr>
+            <w:r>
+              <w:rPr>
+                <w:b/>
+              </w:rPr>
+              <w:t>válido?</w:t>
+            </w:r>
+          </w:p>
+        </w:tc>
+      </w:tr>
+      <w:tr>
+        <w:trPr>
+          <w:cantSplit/>
+        </w:trPr>
+        <w:tc>
+          <w:tcPr>
+            <w:tcW w:w="800" w:type="dxa"/>
+            <w:vAlign w:val="center"/>
+          </w:tcPr>
+          <w:p>
+            <w:pPr>
+              <w:keepNext/>
+              <w:jc w:val="center"/>
+            </w:pPr>
+            <w:r>
+              <w:t>1</w:t>
+            </w:r>
+          </w:p>
+        </w:tc>
+        <w:tc>
+          <w:tcPr>
+            <w:tcW w:w="2200" w:type="dxa"/>
+            <w:vAlign w:val="center"/>
+          </w:tcPr>
+          <w:p>
+            <w:pPr>
+              <w:keepNext/>
+              <w:jc w:val="center"/>
+            </w:pPr>
+            <w:r>
+              <w:t>1 (sim)</w:t>
+            </w:r>
+          </w:p>
+        </w:tc>
+        <w:tc>
+          <w:tcPr>
+            <w:tcW w:w="2400" w:type="dxa"/>
+            <w:vAlign w:val="center"/>
+          </w:tcPr>
+          <w:p>
+            <w:pPr>
+              <w:keepNext/>
+              <w:jc w:val="center"/>
+            </w:pPr>
+            <w:r>
+              <w:t>15</w:t>
+            </w:r>
+          </w:p>
+        </w:tc>
+        <w:tc>
+          <w:tcPr>
+            <w:tcW w:w="1500" w:type="dxa"/>
+            <w:vAlign w:val="center"/>
+          </w:tcPr>
+          <w:p>
+            <w:pPr>
+              <w:keepNext/>
+              <w:jc w:val="center"/>
+            </w:pPr>
+            <w:r>
+              <w:t>0</w:t>
+            </w:r>
+          </w:p>
+        </w:tc>
+        <w:tc>
+          <w:tcPr>
+            <w:tcW w:w="1604" w:type="dxa"/>
+            <w:vAlign w:val="center"/>
+          </w:tcPr>
+          <w:p>
+            <w:pPr>
+              <w:keepNext/>
+              <w:jc w:val="center"/>
+            </w:pPr>
+            <w:r>
+              <w:t>sim</w:t>
+            </w:r>
+          </w:p>
+        </w:tc>
+      </w:tr>
+      <w:tr>
+        <w:trPr>
+          <w:cantSplit/>
+        </w:trPr>
+        <w:tc>
+          <w:tcPr>
+            <w:tcW w:w="800" w:type="dxa"/>
+            <w:vAlign w:val="center"/>
+          </w:tcPr>
+          <w:p>
+            <w:pPr>
+              <w:keepNext/>
+              <w:jc w:val="center"/>
+            </w:pPr>
+            <w:r>
+              <w:t>2</w:t>
+            </w:r>
+          </w:p>
+        </w:tc>
+        <w:tc>
+          <w:tcPr>
+            <w:tcW w:w="2200" w:type="dxa"/>
+            <w:vAlign w:val="center"/>
+          </w:tcPr>
+          <w:p>
+            <w:pPr>
+              <w:keepNext/>
+              <w:jc w:val="center"/>
+            </w:pPr>
+            <w:r>
+              <w:t>3 (sim)</w:t>
+            </w:r>
+          </w:p>
+        </w:tc>
+        <w:tc>
+          <w:tcPr>
+            <w:tcW w:w="2400" w:type="dxa"/>
+            <w:vAlign w:val="center"/>
+          </w:tcPr>
+          <w:p>
+            <w:pPr>
+              <w:keepNext/>
+              <w:jc w:val="center"/>
+            </w:pPr>
+            <w:r>
+              <w:t>14</w:t>
+            </w:r>
+          </w:p>
+        </w:tc>
+        <w:tc>
+          <w:tcPr>
+            <w:tcW w:w="1500" w:type="dxa"/>
+            <w:vAlign w:val="center"/>
+          </w:tcPr>
+          <w:p>
+            <w:pPr>
+              <w:keepNext/>
+              <w:jc w:val="center"/>
+            </w:pPr>
+            <w:r>
+              <w:t>0</w:t>
+            </w:r>
+          </w:p>
+        </w:tc>
+        <w:tc>
+          <w:tcPr>
+            <w:tcW w:w="1604" w:type="dxa"/>
+            <w:vAlign w:val="center"/>
+          </w:tcPr>
+          <w:p>
+            <w:pPr>
+              <w:keepNext/>
+              <w:jc w:val="center"/>
+            </w:pPr>
+            <w:r>
+              <w:t>sim</w:t>
+            </w:r>
+          </w:p>
+        </w:tc>
+      </w:tr>
+      <w:tr>
+        <w:trPr>
+          <w:cantSplit/>
+        </w:trPr>
+        <w:tc>
+          <w:tcPr>
+            <w:tcW w:w="800" w:type="dxa"/>
+            <w:vAlign w:val="center"/>
+          </w:tcPr>
+          <w:p>
+            <w:pPr>
+              <w:keepNext/>
+              <w:jc w:val="center"/>
+            </w:pPr>
+            <w:r>
+              <w:t>3</w:t>
+            </w:r>
+          </w:p>
+        </w:tc>
+        <w:tc>
+          <w:tcPr>
+            <w:tcW w:w="2200" w:type="dxa"/>
+            <w:vAlign w:val="center"/>
+          </w:tcPr>
+          <w:p>
+            <w:pPr>
+              <w:keepNext/>
+              <w:jc w:val="center"/>
+            </w:pPr>
+            <w:r>
+              <w:t>6 (sim)</w:t>
+            </w:r>
+          </w:p>
+        </w:tc>
+        <w:tc>
+          <w:tcPr>
+            <w:tcW w:w="2400" w:type="dxa"/>
+            <w:vAlign w:val="center"/>
+          </w:tcPr>
+          <w:p>
+            <w:pPr>
+              <w:keepNext/>
+              <w:jc w:val="center"/>
+            </w:pPr>
+            <w:r>
+              <w:t>12</w:t>
+            </w:r>
+          </w:p>
+        </w:tc>
+        <w:tc>
+          <w:tcPr>
+            <w:tcW w:w="1500" w:type="dxa"/>
+            <w:vAlign w:val="center"/>
+          </w:tcPr>
+          <w:p>
+            <w:pPr>
+              <w:keepNext/>
+              <w:jc w:val="center"/>
+            </w:pPr>
+            <w:r>
+              <w:t>0</w:t>
+            </w:r>
+          </w:p>
+        </w:tc>
+        <w:tc>
+          <w:tcPr>
+            <w:tcW w:w="1604" w:type="dxa"/>
+            <w:vAlign w:val="center"/>
+          </w:tcPr>
+          <w:p>
+            <w:pPr>
+              <w:keepNext/>
+              <w:jc w:val="center"/>
+            </w:pPr>
+            <w:r>
+              <w:t>sim</w:t>
+            </w:r>
+          </w:p>
+        </w:tc>
+      </w:tr>
+      <w:tr>
+        <w:trPr>
+          <w:cantSplit/>
+        </w:trPr>
+        <w:tc>
+          <w:tcPr>
+            <w:tcW w:w="800" w:type="dxa"/>
+            <w:vAlign w:val="center"/>
+          </w:tcPr>
+          <w:p>
+            <w:pPr>
+              <w:keepNext/>
+              <w:jc w:val="center"/>
+            </w:pPr>
+            <w:r>
+              <w:t>4</w:t>
+            </w:r>
+          </w:p>
+        </w:tc>
+        <w:tc>
+          <w:tcPr>
+            <w:tcW w:w="2200" w:type="dxa"/>
+            <w:vAlign w:val="center"/>
+          </w:tcPr>
+          <w:p>
+            <w:pPr>
+              <w:keepNext/>
+              <w:jc w:val="center"/>
+            </w:pPr>
+            <w:r>
+              <w:t>10 (sim)</w:t>
+            </w:r>
+          </w:p>
+        </w:tc>
+        <w:tc>
+          <w:tcPr>
+            <w:tcW w:w="2400" w:type="dxa"/>
+            <w:vAlign w:val="center"/>
+          </w:tcPr>
+          <w:p>
+            <w:pPr>
+              <w:keepNext/>
+              <w:jc w:val="center"/>
+            </w:pPr>
+            <w:r>
+              <w:t>9</w:t>
+            </w:r>
+          </w:p>
+        </w:tc>
+        <w:tc>
+          <w:tcPr>
+            <w:tcW w:w="1500" w:type="dxa"/>
+            <w:vAlign w:val="center"/>
+          </w:tcPr>
+          <w:p>
+            <w:pPr>
+              <w:keepNext/>
+              <w:jc w:val="center"/>
+            </w:pPr>
+            <w:r>
+              <w:t>1</w:t>
+            </w:r>
+          </w:p>
+        </w:tc>
+        <w:tc>
+          <w:tcPr>
+            <w:tcW w:w="1604" w:type="dxa"/>
+            <w:vAlign w:val="center"/>
+          </w:tcPr>
+          <w:p>
+            <w:pPr>
+              <w:keepNext/>
+              <w:jc w:val="center"/>
+            </w:pPr>
+            <w:r>
+              <w:t>não</w:t>
+            </w:r>
+          </w:p>
+        </w:tc>
+      </w:tr>
+      <w:tr>
+        <w:trPr>
+          <w:cantSplit/>
+        </w:trPr>
+        <w:tc>
+          <w:tcPr>
+            <w:tcW w:w="800" w:type="dxa"/>
+            <w:vAlign w:val="center"/>
+          </w:tcPr>
+          <w:p>
+            <w:pPr>
+              <w:keepNext/>
+              <w:jc w:val="center"/>
+            </w:pPr>
+            <w:r>
+              <w:t>5</w:t>
+            </w:r>
+          </w:p>
+        </w:tc>
+        <w:tc>
+          <w:tcPr>
+            <w:tcW w:w="2200" w:type="dxa"/>
+            <w:vAlign w:val="center"/>
+          </w:tcPr>
+          <w:p>
+            <w:pPr>
+              <w:keepNext/>
+              <w:jc w:val="center"/>
+            </w:pPr>
+            <w:r>
+              <w:t>15 (sim)</w:t>
+            </w:r>
+          </w:p>
+        </w:tc>
+        <w:tc>
+          <w:tcPr>
+            <w:tcW w:w="2400" w:type="dxa"/>
+            <w:vAlign w:val="center"/>
+          </w:tcPr>
+          <w:p>
+            <w:pPr>
+              <w:keepNext/>
+              <w:jc w:val="center"/>
+            </w:pPr>
+            <w:r>
+              <w:t>5</w:t>
+            </w:r>
+          </w:p>
+        </w:tc>
+        <w:tc>
+          <w:tcPr>
+            <w:tcW w:w="1500" w:type="dxa"/>
+            <w:vAlign w:val="center"/>
+          </w:tcPr>
+          <w:p>
+            <w:pPr>
+              <w:keepNext/>
+              <w:jc w:val="center"/>
+            </w:pPr>
+            <w:r>
+              <w:t>0</w:t>
+            </w:r>
+          </w:p>
+        </w:tc>
+        <w:tc>
+          <w:tcPr>
+            <w:tcW w:w="1604" w:type="dxa"/>
+            <w:vAlign w:val="center"/>
+          </w:tcPr>
+          <w:p>
+            <w:pPr>
+              <w:keepNext/>
+              <w:jc w:val="center"/>
+            </w:pPr>
+            <w:r>
+              <w:t>sim</w:t>
+            </w:r>
+          </w:p>
+        </w:tc>
+      </w:tr>
+      <w:tr>
+        <w:trPr>
+          <w:cantSplit/>
+        </w:trPr>
+        <w:tc>
+          <w:tcPr>
+            <w:tcW w:w="800" w:type="dxa"/>
+            <w:vAlign w:val="center"/>
+          </w:tcPr>
+          <w:p>
+            <w:pPr>
+              <w:jc w:val="center"/>
+            </w:pPr>
+            <w:r>
+              <w:t>6</w:t>
+            </w:r>
+          </w:p>
+        </w:tc>
+        <w:tc>
+          <w:tcPr>
+            <w:tcW w:w="2200" w:type="dxa"/>
+            <w:vAlign w:val="center"/>
+          </w:tcPr>
+          <w:p>
+            <w:pPr>
+              <w:jc w:val="center"/>
+            </w:pPr>
+            <w:r>
+              <w:t>21 (não)</w:t>
+            </w:r>
+          </w:p>
+        </w:tc>
+        <w:tc>
+          <w:tcPr>
+            <w:tcW w:w="2400" w:type="dxa"/>
+            <w:vAlign w:val="center"/>
+          </w:tcPr>
+          <w:p>
+            <w:pPr>
+              <w:jc w:val="center"/>
+            </w:pPr>
+            <w:r>
+              <w:t>—</w:t>
+            </w:r>
+          </w:p>
+        </w:tc>
+        <w:tc>
+          <w:tcPr>
+            <w:tcW w:w="1500" w:type="dxa"/>
+            <w:vAlign w:val="center"/>
+          </w:tcPr>
+          <w:p>
+            <w:pPr>
+              <w:jc w:val="center"/>
+            </w:pPr>
+            <w:r>
+              <w:t>—</w:t>
+            </w:r>
+          </w:p>
+        </w:tc>
+        <w:tc>
+          <w:tcPr>
+            <w:tcW w:w="1604" w:type="dxa"/>
+            <w:vAlign w:val="center"/>
+          </w:tcPr>
+          <w:p>
+            <w:pPr>
+              <w:jc w:val="center"/>
+            </w:pPr>
+            <w:r>
+              <w:t>para aqui</w:t>
+            </w:r>
+          </w:p>
+        </w:tc>
+      </w:tr>
+    </w:tbl>
+    <w:p>
+      <w:pPr>
+        <w:spacing w:before="240"/>
+      </w:pPr>
+      <w:r>
+        <w:t>Total: 4 decomposições válidas (k=1, 2, 3 e 5), o mesmo valor do enunciado.</w:t>
       </w:r>
     </w:p>
     <w:sectPr>
@@ -1210,7 +2199,7 @@
     </a:clrScheme>
     <a:fontScheme name="Office">
       <a:majorFont>
-        <a:latin typeface="Calibri Light" panose="020F0302020204030204"/>
+        <a:latin typeface="Times New Roman" panose="02020603050405020304"/>
         <a:ea typeface=""/>
         <a:cs typeface=""/>
         <a:font script="Jpan" typeface="游ゴシック Light"/>
@@ -1262,7 +2251,7 @@
         <a:font script="Tfng" typeface="Ebrima"/>
       </a:majorFont>
       <a:minorFont>
-        <a:latin typeface="Calibri" panose="020F0502020204030204"/>
+        <a:latin typeface="Times New Roman" panose="02020603050405020304"/>
         <a:ea typeface=""/>
         <a:cs typeface=""/>
         <a:font script="Jpan" typeface="游明朝"/>

</xml_diff>

<commit_message>
Insere o gráfico de eficiência feito no Excel pelo usuário
Substitui o gráfico gerado por script (rejeitado por não ter cara de
Excel) por um gráfico de dispersão nativo, feito manualmente no Excel:
escala logarítmica nos dois eixos, título e legendas dos eixos. Gráfico
centralizado na página, com legenda "Figura 1" e espaçamento ajustado
em relação ao texto ao redor.

Co-Authored-By: Claude Sonnet 5 <noreply@anthropic.com>
</commit_message>
<xml_diff>
--- a/Trabalho1/relatorio-trabalho1.docx
+++ b/Trabalho1/relatorio-trabalho1.docx
@@ -624,12 +624,12 @@
           <w:i/>
           <w:sz w:val="20"/>
         </w:rPr>
+        <w:lastRenderedPageBreak/>
         <w:t>Tabela 1 – Execução do algoritmo para n = 15</w:t>
       </w:r>
     </w:p>
     <w:tbl>
       <w:tblPr>
-        <w:tblStyle w:val="Tabelanormal"/>
         <w:tblW w:w="8504" w:type="dxa"/>
         <w:tblBorders>
           <w:top w:val="single" w:sz="4" w:space="0" w:color="auto"/>
@@ -639,6 +639,7 @@
           <w:insideH w:val="single" w:sz="4" w:space="0" w:color="auto"/>
           <w:insideV w:val="single" w:sz="4" w:space="0" w:color="auto"/>
         </w:tblBorders>
+        <w:tblLook w:val="04A0" w:firstRow="1" w:lastRow="0" w:firstColumn="1" w:lastColumn="0" w:noHBand="0" w:noVBand="1"/>
       </w:tblPr>
       <w:tblGrid>
         <w:gridCol w:w="800"/>
@@ -1224,6 +1225,520 @@
       </w:pPr>
       <w:r>
         <w:t>Total: 4 decomposições válidas (k=1, 2, 3 e 5), o mesmo valor do enunciado.</w:t>
+      </w:r>
+    </w:p>
+    <w:p>
+      <w:pPr>
+        <w:pStyle w:val="Ttulo1"/>
+      </w:pPr>
+      <w:r>
+        <w:t>4. Eficiência</w:t>
+      </w:r>
+    </w:p>
+    <w:p>
+      <w:r>
+        <w:t>Na versão inicial, para cada n são testados até n pontos de partida diferentes, e cada um deles soma seus termos um a um até ultrapassar n. Isso faz o tempo crescer muito mais rápido que o tamanho da entrada — além de, como já mostrado na Seção 3, estourar a pilha de execução para n a partir de aproximadamente 64 mil.</w:t>
+      </w:r>
+    </w:p>
+    <w:p>
+      <w:r>
+        <w:t>Na versão final, o valor de k só precisa crescer até a soma mínima (1+2+...+k) ultrapassar n, ou seja, até k chegar perto de √(2n). Isso limita o número de passos por número a uma quantidade bem menor e previsível, o que se reflete diretamente no tempo de execução.</w:t>
+      </w:r>
+    </w:p>
+    <w:p>
+      <w:r>
+        <w:t>Para comparar as duas versões na prática, ambas foram executadas sobre faixas pequenas (de 500 até 32.000 — acima disso a versão ingênua estoura a pilha, como dito na Seção 3):</w:t>
+      </w:r>
+    </w:p>
+    <w:p>
+      <w:pPr>
+        <w:keepNext/>
+        <w:jc w:val="center"/>
+      </w:pPr>
+      <w:r>
+        <w:rPr>
+          <w:i/>
+          <w:sz w:val="20"/>
+        </w:rPr>
+        <w:t>Tabela 2 – Tempo de execução das duas versões, por tamanho de faixa testado</w:t>
+      </w:r>
+    </w:p>
+    <w:tbl>
+      <w:tblPr>
+        <w:tblW w:w="8504" w:type="dxa"/>
+        <w:tblBorders>
+          <w:top w:val="single" w:sz="4" w:space="0" w:color="auto"/>
+          <w:left w:val="single" w:sz="4" w:space="0" w:color="auto"/>
+          <w:bottom w:val="single" w:sz="4" w:space="0" w:color="auto"/>
+          <w:right w:val="single" w:sz="4" w:space="0" w:color="auto"/>
+          <w:insideH w:val="single" w:sz="4" w:space="0" w:color="auto"/>
+          <w:insideV w:val="single" w:sz="4" w:space="0" w:color="auto"/>
+        </w:tblBorders>
+        <w:tblLook w:val="04A0" w:firstRow="1" w:lastRow="0" w:firstColumn="1" w:lastColumn="0" w:noHBand="0" w:noVBand="1"/>
+      </w:tblPr>
+      <w:tblGrid>
+        <w:gridCol w:w="3504"/>
+        <w:gridCol w:w="2500"/>
+        <w:gridCol w:w="2500"/>
+      </w:tblGrid>
+      <w:tr>
+        <w:trPr>
+          <w:cantSplit/>
+        </w:trPr>
+        <w:tc>
+          <w:tcPr>
+            <w:tcW w:w="3504" w:type="dxa"/>
+            <w:vAlign w:val="center"/>
+          </w:tcPr>
+          <w:p>
+            <w:pPr>
+              <w:keepNext/>
+              <w:jc w:val="center"/>
+            </w:pPr>
+            <w:r>
+              <w:rPr>
+                <w:b/>
+              </w:rPr>
+              <w:t>Tamanho da faixa (2 até N)</w:t>
+            </w:r>
+          </w:p>
+        </w:tc>
+        <w:tc>
+          <w:tcPr>
+            <w:tcW w:w="2500" w:type="dxa"/>
+            <w:vAlign w:val="center"/>
+          </w:tcPr>
+          <w:p>
+            <w:pPr>
+              <w:keepNext/>
+              <w:jc w:val="center"/>
+            </w:pPr>
+            <w:r>
+              <w:rPr>
+                <w:b/>
+              </w:rPr>
+              <w:t>Versão ingênua</w:t>
+            </w:r>
+          </w:p>
+        </w:tc>
+        <w:tc>
+          <w:tcPr>
+            <w:tcW w:w="2500" w:type="dxa"/>
+            <w:vAlign w:val="center"/>
+          </w:tcPr>
+          <w:p>
+            <w:pPr>
+              <w:keepNext/>
+              <w:jc w:val="center"/>
+            </w:pPr>
+            <w:r>
+              <w:rPr>
+                <w:b/>
+              </w:rPr>
+              <w:t>Versão final</w:t>
+            </w:r>
+          </w:p>
+        </w:tc>
+      </w:tr>
+      <w:tr>
+        <w:trPr>
+          <w:cantSplit/>
+        </w:trPr>
+        <w:tc>
+          <w:tcPr>
+            <w:tcW w:w="3504" w:type="dxa"/>
+            <w:vAlign w:val="center"/>
+          </w:tcPr>
+          <w:p>
+            <w:pPr>
+              <w:keepNext/>
+              <w:jc w:val="center"/>
+            </w:pPr>
+            <w:r>
+              <w:t>500</w:t>
+            </w:r>
+          </w:p>
+        </w:tc>
+        <w:tc>
+          <w:tcPr>
+            <w:tcW w:w="2500" w:type="dxa"/>
+            <w:vAlign w:val="center"/>
+          </w:tcPr>
+          <w:p>
+            <w:pPr>
+              <w:keepNext/>
+              <w:jc w:val="center"/>
+            </w:pPr>
+            <w:r>
+              <w:t>0,001s</w:t>
+            </w:r>
+          </w:p>
+        </w:tc>
+        <w:tc>
+          <w:tcPr>
+            <w:tcW w:w="2500" w:type="dxa"/>
+            <w:vAlign w:val="center"/>
+          </w:tcPr>
+          <w:p>
+            <w:pPr>
+              <w:keepNext/>
+              <w:jc w:val="center"/>
+            </w:pPr>
+            <w:r>
+              <w:t>0,000s</w:t>
+            </w:r>
+          </w:p>
+        </w:tc>
+      </w:tr>
+      <w:tr>
+        <w:trPr>
+          <w:cantSplit/>
+        </w:trPr>
+        <w:tc>
+          <w:tcPr>
+            <w:tcW w:w="3504" w:type="dxa"/>
+            <w:vAlign w:val="center"/>
+          </w:tcPr>
+          <w:p>
+            <w:pPr>
+              <w:keepNext/>
+              <w:jc w:val="center"/>
+            </w:pPr>
+            <w:r>
+              <w:t>1.000</w:t>
+            </w:r>
+          </w:p>
+        </w:tc>
+        <w:tc>
+          <w:tcPr>
+            <w:tcW w:w="2500" w:type="dxa"/>
+            <w:vAlign w:val="center"/>
+          </w:tcPr>
+          <w:p>
+            <w:pPr>
+              <w:keepNext/>
+              <w:jc w:val="center"/>
+            </w:pPr>
+            <w:r>
+              <w:t>0,003s</w:t>
+            </w:r>
+          </w:p>
+        </w:tc>
+        <w:tc>
+          <w:tcPr>
+            <w:tcW w:w="2500" w:type="dxa"/>
+            <w:vAlign w:val="center"/>
+          </w:tcPr>
+          <w:p>
+            <w:pPr>
+              <w:keepNext/>
+              <w:jc w:val="center"/>
+            </w:pPr>
+            <w:r>
+              <w:t>0,000s</w:t>
+            </w:r>
+          </w:p>
+        </w:tc>
+      </w:tr>
+      <w:tr>
+        <w:trPr>
+          <w:cantSplit/>
+        </w:trPr>
+        <w:tc>
+          <w:tcPr>
+            <w:tcW w:w="3504" w:type="dxa"/>
+            <w:vAlign w:val="center"/>
+          </w:tcPr>
+          <w:p>
+            <w:pPr>
+              <w:keepNext/>
+              <w:jc w:val="center"/>
+            </w:pPr>
+            <w:r>
+              <w:t>2.000</w:t>
+            </w:r>
+          </w:p>
+        </w:tc>
+        <w:tc>
+          <w:tcPr>
+            <w:tcW w:w="2500" w:type="dxa"/>
+            <w:vAlign w:val="center"/>
+          </w:tcPr>
+          <w:p>
+            <w:pPr>
+              <w:keepNext/>
+              <w:jc w:val="center"/>
+            </w:pPr>
+            <w:r>
+              <w:t>0,011s</w:t>
+            </w:r>
+          </w:p>
+        </w:tc>
+        <w:tc>
+          <w:tcPr>
+            <w:tcW w:w="2500" w:type="dxa"/>
+            <w:vAlign w:val="center"/>
+          </w:tcPr>
+          <w:p>
+            <w:pPr>
+              <w:keepNext/>
+              <w:jc w:val="center"/>
+            </w:pPr>
+            <w:r>
+              <w:t>0,000s</w:t>
+            </w:r>
+          </w:p>
+        </w:tc>
+      </w:tr>
+      <w:tr>
+        <w:trPr>
+          <w:cantSplit/>
+        </w:trPr>
+        <w:tc>
+          <w:tcPr>
+            <w:tcW w:w="3504" w:type="dxa"/>
+            <w:vAlign w:val="center"/>
+          </w:tcPr>
+          <w:p>
+            <w:pPr>
+              <w:keepNext/>
+              <w:jc w:val="center"/>
+            </w:pPr>
+            <w:r>
+              <w:t>4.000</w:t>
+            </w:r>
+          </w:p>
+        </w:tc>
+        <w:tc>
+          <w:tcPr>
+            <w:tcW w:w="2500" w:type="dxa"/>
+            <w:vAlign w:val="center"/>
+          </w:tcPr>
+          <w:p>
+            <w:pPr>
+              <w:keepNext/>
+              <w:jc w:val="center"/>
+            </w:pPr>
+            <w:r>
+              <w:t>0,048s</w:t>
+            </w:r>
+          </w:p>
+        </w:tc>
+        <w:tc>
+          <w:tcPr>
+            <w:tcW w:w="2500" w:type="dxa"/>
+            <w:vAlign w:val="center"/>
+          </w:tcPr>
+          <w:p>
+            <w:pPr>
+              <w:keepNext/>
+              <w:jc w:val="center"/>
+            </w:pPr>
+            <w:r>
+              <w:t>0,000s</w:t>
+            </w:r>
+          </w:p>
+        </w:tc>
+      </w:tr>
+      <w:tr>
+        <w:trPr>
+          <w:cantSplit/>
+        </w:trPr>
+        <w:tc>
+          <w:tcPr>
+            <w:tcW w:w="3504" w:type="dxa"/>
+            <w:vAlign w:val="center"/>
+          </w:tcPr>
+          <w:p>
+            <w:pPr>
+              <w:keepNext/>
+              <w:jc w:val="center"/>
+            </w:pPr>
+            <w:r>
+              <w:t>8.000</w:t>
+            </w:r>
+          </w:p>
+        </w:tc>
+        <w:tc>
+          <w:tcPr>
+            <w:tcW w:w="2500" w:type="dxa"/>
+            <w:vAlign w:val="center"/>
+          </w:tcPr>
+          <w:p>
+            <w:pPr>
+              <w:keepNext/>
+              <w:jc w:val="center"/>
+            </w:pPr>
+            <w:r>
+              <w:t>0,221s</w:t>
+            </w:r>
+          </w:p>
+        </w:tc>
+        <w:tc>
+          <w:tcPr>
+            <w:tcW w:w="2500" w:type="dxa"/>
+            <w:vAlign w:val="center"/>
+          </w:tcPr>
+          <w:p>
+            <w:pPr>
+              <w:keepNext/>
+              <w:jc w:val="center"/>
+            </w:pPr>
+            <w:r>
+              <w:t>0,002s</w:t>
+            </w:r>
+          </w:p>
+        </w:tc>
+      </w:tr>
+      <w:tr>
+        <w:trPr>
+          <w:cantSplit/>
+        </w:trPr>
+        <w:tc>
+          <w:tcPr>
+            <w:tcW w:w="3504" w:type="dxa"/>
+            <w:vAlign w:val="center"/>
+          </w:tcPr>
+          <w:p>
+            <w:pPr>
+              <w:keepNext/>
+              <w:jc w:val="center"/>
+            </w:pPr>
+            <w:r>
+              <w:t>16.000</w:t>
+            </w:r>
+          </w:p>
+        </w:tc>
+        <w:tc>
+          <w:tcPr>
+            <w:tcW w:w="2500" w:type="dxa"/>
+            <w:vAlign w:val="center"/>
+          </w:tcPr>
+          <w:p>
+            <w:pPr>
+              <w:keepNext/>
+              <w:jc w:val="center"/>
+            </w:pPr>
+            <w:r>
+              <w:t>1,074s</w:t>
+            </w:r>
+          </w:p>
+        </w:tc>
+        <w:tc>
+          <w:tcPr>
+            <w:tcW w:w="2500" w:type="dxa"/>
+            <w:vAlign w:val="center"/>
+          </w:tcPr>
+          <w:p>
+            <w:pPr>
+              <w:keepNext/>
+              <w:jc w:val="center"/>
+            </w:pPr>
+            <w:r>
+              <w:t>0,006s</w:t>
+            </w:r>
+          </w:p>
+        </w:tc>
+      </w:tr>
+      <w:tr>
+        <w:trPr>
+          <w:cantSplit/>
+        </w:trPr>
+        <w:tc>
+          <w:tcPr>
+            <w:tcW w:w="3504" w:type="dxa"/>
+            <w:vAlign w:val="center"/>
+          </w:tcPr>
+          <w:p>
+            <w:pPr>
+              <w:jc w:val="center"/>
+            </w:pPr>
+            <w:r>
+              <w:t>32.000</w:t>
+            </w:r>
+          </w:p>
+        </w:tc>
+        <w:tc>
+          <w:tcPr>
+            <w:tcW w:w="2500" w:type="dxa"/>
+            <w:vAlign w:val="center"/>
+          </w:tcPr>
+          <w:p>
+            <w:pPr>
+              <w:jc w:val="center"/>
+            </w:pPr>
+            <w:r>
+              <w:t>4,936s</w:t>
+            </w:r>
+          </w:p>
+        </w:tc>
+        <w:tc>
+          <w:tcPr>
+            <w:tcW w:w="2500" w:type="dxa"/>
+            <w:vAlign w:val="center"/>
+          </w:tcPr>
+          <w:p>
+            <w:pPr>
+              <w:jc w:val="center"/>
+            </w:pPr>
+            <w:r>
+              <w:t>0,016s</w:t>
+            </w:r>
+          </w:p>
+        </w:tc>
+      </w:tr>
+    </w:tbl>
+    <w:p>
+      <w:r>
+        <w:lastRenderedPageBreak/>
+        <w:t>Para os tamanhos menores (500 e 1.000), o tempo da versão final é tão pequeno que passa a ser dominado por ruído de medição da própria JVM, e não pelo algoritmo em si — por isso ele não cresce de forma perfeitamente suave logo no início do gráfico abaixo.</w:t>
+      </w:r>
+    </w:p>
+    <w:p>
+      <w:pPr>
+        <w:spacing w:before="240" w:after="240"/>
+        <w:jc w:val="center"/>
+      </w:pPr>
+      <w:r>
+        <w:rPr>
+          <w:noProof/>
+        </w:rPr>
+        <w:drawing>
+          <wp:inline distT="0" distB="0" distL="0" distR="0" wp14:anchorId="6F43AE3E" wp14:editId="27721D0B">
+            <wp:extent cx="5400040" cy="3281045"/>
+            <wp:effectExtent l="0" t="0" r="10160" b="8255"/>
+            <wp:docPr id="1411906249" name="Gráfico 1">
+              <a:extLst xmlns:a="http://schemas.openxmlformats.org/drawingml/2006/main">
+                <a:ext uri="{FF2B5EF4-FFF2-40B4-BE49-F238E27FC236}">
+                  <a16:creationId xmlns:a16="http://schemas.microsoft.com/office/drawing/2014/main" id="{CB06CC82-6601-86F2-1494-4D080A9DD7BD}"/>
+                </a:ext>
+              </a:extLst>
+            </wp:docPr>
+            <wp:cNvGraphicFramePr/>
+            <a:graphic xmlns:a="http://schemas.openxmlformats.org/drawingml/2006/main">
+              <a:graphicData uri="http://schemas.openxmlformats.org/drawingml/2006/chart">
+                <c:chart xmlns:c="http://schemas.openxmlformats.org/drawingml/2006/chart" xmlns:r="http://schemas.openxmlformats.org/officeDocument/2006/relationships" r:id="rId4"/>
+              </a:graphicData>
+            </a:graphic>
+          </wp:inline>
+        </w:drawing>
+      </w:r>
+    </w:p>
+    <w:p>
+      <w:pPr>
+        <w:jc w:val="center"/>
+      </w:pPr>
+      <w:r>
+        <w:rPr>
+          <w:i/>
+          <w:sz w:val="20"/>
+        </w:rPr>
+        <w:t>Figura 1 – Tempo (s) por tamanho da faixa testado, escala logarítmica nos dois eixos</w:t>
+      </w:r>
+    </w:p>
+    <w:p>
+      <w:r>
+        <w:t>Com a versão final, as sete faixas pedidas pelo enunciado — a maior delas indo de 1.500.000 até 2.000.000 — foram resolvidas em cerca de 9,1 segundos no total (detalhes por faixa na Seção 5), o que mostra que a solução escala bem para o tamanho real do problema.</w:t>
       </w:r>
     </w:p>
     <w:sectPr>
@@ -2156,6 +2671,1178 @@
 </w:styles>
 </file>
 
+<file path=word/charts/chart1.xml><?xml version="1.0" encoding="utf-8"?>
+<c:chartSpace xmlns:c="http://schemas.openxmlformats.org/drawingml/2006/chart" xmlns:a="http://schemas.openxmlformats.org/drawingml/2006/main" xmlns:r="http://schemas.openxmlformats.org/officeDocument/2006/relationships" xmlns:c16r2="http://schemas.microsoft.com/office/drawing/2015/06/chart">
+  <c:date1904 val="0"/>
+  <c:lang val="pt-BR"/>
+  <c:roundedCorners val="0"/>
+  <mc:AlternateContent xmlns:mc="http://schemas.openxmlformats.org/markup-compatibility/2006">
+    <mc:Choice xmlns:c14="http://schemas.microsoft.com/office/drawing/2007/8/2/chart" Requires="c14">
+      <c14:style val="102"/>
+    </mc:Choice>
+    <mc:Fallback>
+      <c:style val="2"/>
+    </mc:Fallback>
+  </mc:AlternateContent>
+  <c:chart>
+    <c:title>
+      <c:tx>
+        <c:rich>
+          <a:bodyPr rot="0" spcFirstLastPara="1" vertOverflow="ellipsis" vert="horz" wrap="square" anchor="ctr" anchorCtr="1"/>
+          <a:lstStyle/>
+          <a:p>
+            <a:pPr>
+              <a:defRPr sz="1400" b="0" i="0" u="none" strike="noStrike" kern="1200" spc="0" baseline="0">
+                <a:solidFill>
+                  <a:schemeClr val="tx1">
+                    <a:lumMod val="65000"/>
+                    <a:lumOff val="35000"/>
+                  </a:schemeClr>
+                </a:solidFill>
+                <a:latin typeface="+mn-lt"/>
+                <a:ea typeface="+mn-ea"/>
+                <a:cs typeface="+mn-cs"/>
+              </a:defRPr>
+            </a:pPr>
+            <a:r>
+              <a:rPr lang="pt-BR" sz="1400" b="0" i="0" u="none" strike="noStrike" baseline="0"/>
+              <a:t>Tempo de execução: versão ingênua x versão final</a:t>
+            </a:r>
+            <a:endParaRPr lang="pt-BR"/>
+          </a:p>
+        </c:rich>
+      </c:tx>
+      <c:overlay val="0"/>
+      <c:spPr>
+        <a:noFill/>
+        <a:ln>
+          <a:noFill/>
+        </a:ln>
+        <a:effectLst/>
+      </c:spPr>
+      <c:txPr>
+        <a:bodyPr rot="0" spcFirstLastPara="1" vertOverflow="ellipsis" vert="horz" wrap="square" anchor="ctr" anchorCtr="1"/>
+        <a:lstStyle/>
+        <a:p>
+          <a:pPr>
+            <a:defRPr sz="1400" b="0" i="0" u="none" strike="noStrike" kern="1200" spc="0" baseline="0">
+              <a:solidFill>
+                <a:schemeClr val="tx1">
+                  <a:lumMod val="65000"/>
+                  <a:lumOff val="35000"/>
+                </a:schemeClr>
+              </a:solidFill>
+              <a:latin typeface="+mn-lt"/>
+              <a:ea typeface="+mn-ea"/>
+              <a:cs typeface="+mn-cs"/>
+            </a:defRPr>
+          </a:pPr>
+          <a:endParaRPr lang="pt-BR"/>
+        </a:p>
+      </c:txPr>
+    </c:title>
+    <c:autoTitleDeleted val="0"/>
+    <c:plotArea>
+      <c:layout/>
+      <c:scatterChart>
+        <c:scatterStyle val="smoothMarker"/>
+        <c:varyColors val="0"/>
+        <c:ser>
+          <c:idx val="0"/>
+          <c:order val="0"/>
+          <c:tx>
+            <c:strRef>
+              <c:f>Eficiência!$B$1</c:f>
+              <c:strCache>
+                <c:ptCount val="1"/>
+                <c:pt idx="0">
+                  <c:v>Versão ingênua (s)</c:v>
+                </c:pt>
+              </c:strCache>
+            </c:strRef>
+          </c:tx>
+          <c:spPr>
+            <a:ln w="19050" cap="rnd">
+              <a:solidFill>
+                <a:schemeClr val="accent1"/>
+              </a:solidFill>
+              <a:round/>
+            </a:ln>
+            <a:effectLst/>
+          </c:spPr>
+          <c:marker>
+            <c:symbol val="circle"/>
+            <c:size val="5"/>
+            <c:spPr>
+              <a:solidFill>
+                <a:schemeClr val="accent1"/>
+              </a:solidFill>
+              <a:ln w="9525">
+                <a:solidFill>
+                  <a:schemeClr val="accent1"/>
+                </a:solidFill>
+              </a:ln>
+              <a:effectLst/>
+            </c:spPr>
+          </c:marker>
+          <c:xVal>
+            <c:numRef>
+              <c:f>Eficiência!$A$2:$A$8</c:f>
+              <c:numCache>
+                <c:formatCode>#,##0</c:formatCode>
+                <c:ptCount val="7"/>
+                <c:pt idx="0">
+                  <c:v>500</c:v>
+                </c:pt>
+                <c:pt idx="1">
+                  <c:v>1000</c:v>
+                </c:pt>
+                <c:pt idx="2">
+                  <c:v>2000</c:v>
+                </c:pt>
+                <c:pt idx="3">
+                  <c:v>4000</c:v>
+                </c:pt>
+                <c:pt idx="4">
+                  <c:v>8000</c:v>
+                </c:pt>
+                <c:pt idx="5">
+                  <c:v>16000</c:v>
+                </c:pt>
+                <c:pt idx="6">
+                  <c:v>32000</c:v>
+                </c:pt>
+              </c:numCache>
+            </c:numRef>
+          </c:xVal>
+          <c:yVal>
+            <c:numRef>
+              <c:f>Eficiência!$B$2:$B$8</c:f>
+              <c:numCache>
+                <c:formatCode>0.000000</c:formatCode>
+                <c:ptCount val="7"/>
+                <c:pt idx="0">
+                  <c:v>1.357708E-3</c:v>
+                </c:pt>
+                <c:pt idx="1">
+                  <c:v>2.621834E-3</c:v>
+                </c:pt>
+                <c:pt idx="2">
+                  <c:v>1.1403084000000001E-2</c:v>
+                </c:pt>
+                <c:pt idx="3">
+                  <c:v>4.8406166E-2</c:v>
+                </c:pt>
+                <c:pt idx="4">
+                  <c:v>0.22054641699999999</c:v>
+                </c:pt>
+                <c:pt idx="5">
+                  <c:v>1.0744721669999999</c:v>
+                </c:pt>
+                <c:pt idx="6">
+                  <c:v>4.9359454170000001</c:v>
+                </c:pt>
+              </c:numCache>
+            </c:numRef>
+          </c:yVal>
+          <c:smooth val="1"/>
+          <c:extLst>
+            <c:ext xmlns:c16="http://schemas.microsoft.com/office/drawing/2014/chart" uri="{C3380CC4-5D6E-409C-BE32-E72D297353CC}">
+              <c16:uniqueId val="{00000000-34F0-604F-AEBD-18D4AB517D41}"/>
+            </c:ext>
+          </c:extLst>
+        </c:ser>
+        <c:ser>
+          <c:idx val="1"/>
+          <c:order val="1"/>
+          <c:tx>
+            <c:strRef>
+              <c:f>Eficiência!$C$1</c:f>
+              <c:strCache>
+                <c:ptCount val="1"/>
+                <c:pt idx="0">
+                  <c:v>Versão final (s)</c:v>
+                </c:pt>
+              </c:strCache>
+            </c:strRef>
+          </c:tx>
+          <c:spPr>
+            <a:ln w="19050" cap="rnd">
+              <a:solidFill>
+                <a:schemeClr val="accent2"/>
+              </a:solidFill>
+              <a:round/>
+            </a:ln>
+            <a:effectLst/>
+          </c:spPr>
+          <c:marker>
+            <c:symbol val="circle"/>
+            <c:size val="5"/>
+            <c:spPr>
+              <a:solidFill>
+                <a:schemeClr val="accent2"/>
+              </a:solidFill>
+              <a:ln w="9525">
+                <a:solidFill>
+                  <a:schemeClr val="accent2"/>
+                </a:solidFill>
+              </a:ln>
+              <a:effectLst/>
+            </c:spPr>
+          </c:marker>
+          <c:xVal>
+            <c:numRef>
+              <c:f>Eficiência!$A$2:$A$8</c:f>
+              <c:numCache>
+                <c:formatCode>#,##0</c:formatCode>
+                <c:ptCount val="7"/>
+                <c:pt idx="0">
+                  <c:v>500</c:v>
+                </c:pt>
+                <c:pt idx="1">
+                  <c:v>1000</c:v>
+                </c:pt>
+                <c:pt idx="2">
+                  <c:v>2000</c:v>
+                </c:pt>
+                <c:pt idx="3">
+                  <c:v>4000</c:v>
+                </c:pt>
+                <c:pt idx="4">
+                  <c:v>8000</c:v>
+                </c:pt>
+                <c:pt idx="5">
+                  <c:v>16000</c:v>
+                </c:pt>
+                <c:pt idx="6">
+                  <c:v>32000</c:v>
+                </c:pt>
+              </c:numCache>
+            </c:numRef>
+          </c:xVal>
+          <c:yVal>
+            <c:numRef>
+              <c:f>Eficiência!$C$2:$C$8</c:f>
+              <c:numCache>
+                <c:formatCode>0.000000</c:formatCode>
+                <c:ptCount val="7"/>
+                <c:pt idx="0">
+                  <c:v>3.0783299999999998E-4</c:v>
+                </c:pt>
+                <c:pt idx="1">
+                  <c:v>6.5083E-5</c:v>
+                </c:pt>
+                <c:pt idx="2">
+                  <c:v>1.7508399999999999E-4</c:v>
+                </c:pt>
+                <c:pt idx="3">
+                  <c:v>3.9625000000000001E-4</c:v>
+                </c:pt>
+                <c:pt idx="4">
+                  <c:v>1.6106250000000001E-3</c:v>
+                </c:pt>
+                <c:pt idx="5">
+                  <c:v>5.7880420000000002E-3</c:v>
+                </c:pt>
+                <c:pt idx="6">
+                  <c:v>1.5852583999999999E-2</c:v>
+                </c:pt>
+              </c:numCache>
+            </c:numRef>
+          </c:yVal>
+          <c:smooth val="1"/>
+          <c:extLst>
+            <c:ext xmlns:c16="http://schemas.microsoft.com/office/drawing/2014/chart" uri="{C3380CC4-5D6E-409C-BE32-E72D297353CC}">
+              <c16:uniqueId val="{00000001-34F0-604F-AEBD-18D4AB517D41}"/>
+            </c:ext>
+          </c:extLst>
+        </c:ser>
+        <c:dLbls>
+          <c:showLegendKey val="0"/>
+          <c:showVal val="0"/>
+          <c:showCatName val="0"/>
+          <c:showSerName val="0"/>
+          <c:showPercent val="0"/>
+          <c:showBubbleSize val="0"/>
+        </c:dLbls>
+        <c:axId val="2022447680"/>
+        <c:axId val="2133889856"/>
+      </c:scatterChart>
+      <c:valAx>
+        <c:axId val="2022447680"/>
+        <c:scaling>
+          <c:logBase val="10"/>
+          <c:orientation val="minMax"/>
+        </c:scaling>
+        <c:delete val="0"/>
+        <c:axPos val="b"/>
+        <c:majorGridlines>
+          <c:spPr>
+            <a:ln w="9525" cap="flat" cmpd="sng" algn="ctr">
+              <a:solidFill>
+                <a:schemeClr val="tx1">
+                  <a:lumMod val="15000"/>
+                  <a:lumOff val="85000"/>
+                </a:schemeClr>
+              </a:solidFill>
+              <a:round/>
+            </a:ln>
+            <a:effectLst/>
+          </c:spPr>
+        </c:majorGridlines>
+        <c:title>
+          <c:tx>
+            <c:rich>
+              <a:bodyPr rot="0" spcFirstLastPara="1" vertOverflow="ellipsis" vert="horz" wrap="square" anchor="ctr" anchorCtr="1"/>
+              <a:lstStyle/>
+              <a:p>
+                <a:pPr>
+                  <a:defRPr sz="1000" b="0" i="0" u="none" strike="noStrike" kern="1200" baseline="0">
+                    <a:solidFill>
+                      <a:schemeClr val="tx1">
+                        <a:lumMod val="65000"/>
+                        <a:lumOff val="35000"/>
+                      </a:schemeClr>
+                    </a:solidFill>
+                    <a:latin typeface="+mn-lt"/>
+                    <a:ea typeface="+mn-ea"/>
+                    <a:cs typeface="+mn-cs"/>
+                  </a:defRPr>
+                </a:pPr>
+                <a:r>
+                  <a:rPr lang="pt-BR" sz="1000" b="0" i="0" u="none" strike="noStrike" baseline="0"/>
+                  <a:t>Tamanho da faixa (2 até N)</a:t>
+                </a:r>
+                <a:endParaRPr lang="pt-BR"/>
+              </a:p>
+            </c:rich>
+          </c:tx>
+          <c:overlay val="0"/>
+          <c:spPr>
+            <a:noFill/>
+            <a:ln>
+              <a:noFill/>
+            </a:ln>
+            <a:effectLst/>
+          </c:spPr>
+          <c:txPr>
+            <a:bodyPr rot="0" spcFirstLastPara="1" vertOverflow="ellipsis" vert="horz" wrap="square" anchor="ctr" anchorCtr="1"/>
+            <a:lstStyle/>
+            <a:p>
+              <a:pPr>
+                <a:defRPr sz="1000" b="0" i="0" u="none" strike="noStrike" kern="1200" baseline="0">
+                  <a:solidFill>
+                    <a:schemeClr val="tx1">
+                      <a:lumMod val="65000"/>
+                      <a:lumOff val="35000"/>
+                    </a:schemeClr>
+                  </a:solidFill>
+                  <a:latin typeface="+mn-lt"/>
+                  <a:ea typeface="+mn-ea"/>
+                  <a:cs typeface="+mn-cs"/>
+                </a:defRPr>
+              </a:pPr>
+              <a:endParaRPr lang="pt-BR"/>
+            </a:p>
+          </c:txPr>
+        </c:title>
+        <c:numFmt formatCode="#,##0" sourceLinked="1"/>
+        <c:majorTickMark val="out"/>
+        <c:minorTickMark val="none"/>
+        <c:tickLblPos val="low"/>
+        <c:spPr>
+          <a:noFill/>
+          <a:ln w="9525" cap="flat" cmpd="sng" algn="ctr">
+            <a:solidFill>
+              <a:schemeClr val="tx1">
+                <a:lumMod val="25000"/>
+                <a:lumOff val="75000"/>
+              </a:schemeClr>
+            </a:solidFill>
+            <a:round/>
+          </a:ln>
+          <a:effectLst/>
+        </c:spPr>
+        <c:txPr>
+          <a:bodyPr rot="0" spcFirstLastPara="1" vertOverflow="ellipsis" wrap="square" anchor="ctr" anchorCtr="1"/>
+          <a:lstStyle/>
+          <a:p>
+            <a:pPr>
+              <a:defRPr sz="900" b="0" i="0" u="none" strike="noStrike" kern="1200" baseline="0">
+                <a:solidFill>
+                  <a:schemeClr val="tx1">
+                    <a:lumMod val="65000"/>
+                    <a:lumOff val="35000"/>
+                  </a:schemeClr>
+                </a:solidFill>
+                <a:latin typeface="+mn-lt"/>
+                <a:ea typeface="+mn-ea"/>
+                <a:cs typeface="+mn-cs"/>
+              </a:defRPr>
+            </a:pPr>
+            <a:endParaRPr lang="pt-BR"/>
+          </a:p>
+        </c:txPr>
+        <c:crossAx val="2133889856"/>
+        <c:crosses val="autoZero"/>
+        <c:crossBetween val="midCat"/>
+      </c:valAx>
+      <c:valAx>
+        <c:axId val="2133889856"/>
+        <c:scaling>
+          <c:logBase val="10"/>
+          <c:orientation val="minMax"/>
+        </c:scaling>
+        <c:delete val="0"/>
+        <c:axPos val="l"/>
+        <c:majorGridlines>
+          <c:spPr>
+            <a:ln w="9525" cap="flat" cmpd="sng" algn="ctr">
+              <a:solidFill>
+                <a:schemeClr val="tx1">
+                  <a:lumMod val="15000"/>
+                  <a:lumOff val="85000"/>
+                </a:schemeClr>
+              </a:solidFill>
+              <a:round/>
+            </a:ln>
+            <a:effectLst/>
+          </c:spPr>
+        </c:majorGridlines>
+        <c:title>
+          <c:tx>
+            <c:rich>
+              <a:bodyPr rot="-5400000" spcFirstLastPara="1" vertOverflow="ellipsis" vert="horz" wrap="square" anchor="ctr" anchorCtr="1"/>
+              <a:lstStyle/>
+              <a:p>
+                <a:pPr>
+                  <a:defRPr sz="1000" b="0" i="0" u="none" strike="noStrike" kern="1200" baseline="0">
+                    <a:solidFill>
+                      <a:schemeClr val="tx1">
+                        <a:lumMod val="65000"/>
+                        <a:lumOff val="35000"/>
+                      </a:schemeClr>
+                    </a:solidFill>
+                    <a:latin typeface="+mn-lt"/>
+                    <a:ea typeface="+mn-ea"/>
+                    <a:cs typeface="+mn-cs"/>
+                  </a:defRPr>
+                </a:pPr>
+                <a:r>
+                  <a:rPr lang="pt-BR" sz="1000" b="0" i="0" u="none" strike="noStrike" baseline="0"/>
+                  <a:t>Tempo (s)</a:t>
+                </a:r>
+                <a:endParaRPr lang="pt-BR"/>
+              </a:p>
+            </c:rich>
+          </c:tx>
+          <c:overlay val="0"/>
+          <c:spPr>
+            <a:noFill/>
+            <a:ln>
+              <a:noFill/>
+            </a:ln>
+            <a:effectLst/>
+          </c:spPr>
+          <c:txPr>
+            <a:bodyPr rot="-5400000" spcFirstLastPara="1" vertOverflow="ellipsis" vert="horz" wrap="square" anchor="ctr" anchorCtr="1"/>
+            <a:lstStyle/>
+            <a:p>
+              <a:pPr>
+                <a:defRPr sz="1000" b="0" i="0" u="none" strike="noStrike" kern="1200" baseline="0">
+                  <a:solidFill>
+                    <a:schemeClr val="tx1">
+                      <a:lumMod val="65000"/>
+                      <a:lumOff val="35000"/>
+                    </a:schemeClr>
+                  </a:solidFill>
+                  <a:latin typeface="+mn-lt"/>
+                  <a:ea typeface="+mn-ea"/>
+                  <a:cs typeface="+mn-cs"/>
+                </a:defRPr>
+              </a:pPr>
+              <a:endParaRPr lang="pt-BR"/>
+            </a:p>
+          </c:txPr>
+        </c:title>
+        <c:numFmt formatCode="0.000000" sourceLinked="1"/>
+        <c:majorTickMark val="none"/>
+        <c:minorTickMark val="none"/>
+        <c:tickLblPos val="nextTo"/>
+        <c:spPr>
+          <a:noFill/>
+          <a:ln w="9525" cap="flat" cmpd="sng" algn="ctr">
+            <a:solidFill>
+              <a:schemeClr val="tx1">
+                <a:lumMod val="25000"/>
+                <a:lumOff val="75000"/>
+              </a:schemeClr>
+            </a:solidFill>
+            <a:round/>
+          </a:ln>
+          <a:effectLst/>
+        </c:spPr>
+        <c:txPr>
+          <a:bodyPr rot="-60000000" spcFirstLastPara="1" vertOverflow="ellipsis" vert="horz" wrap="square" anchor="ctr" anchorCtr="1"/>
+          <a:lstStyle/>
+          <a:p>
+            <a:pPr>
+              <a:defRPr sz="900" b="0" i="0" u="none" strike="noStrike" kern="1200" baseline="0">
+                <a:solidFill>
+                  <a:schemeClr val="tx1">
+                    <a:lumMod val="65000"/>
+                    <a:lumOff val="35000"/>
+                  </a:schemeClr>
+                </a:solidFill>
+                <a:latin typeface="+mn-lt"/>
+                <a:ea typeface="+mn-ea"/>
+                <a:cs typeface="+mn-cs"/>
+              </a:defRPr>
+            </a:pPr>
+            <a:endParaRPr lang="pt-BR"/>
+          </a:p>
+        </c:txPr>
+        <c:crossAx val="2022447680"/>
+        <c:crosses val="autoZero"/>
+        <c:crossBetween val="midCat"/>
+      </c:valAx>
+      <c:spPr>
+        <a:noFill/>
+        <a:ln>
+          <a:noFill/>
+        </a:ln>
+        <a:effectLst/>
+      </c:spPr>
+    </c:plotArea>
+    <c:legend>
+      <c:legendPos val="b"/>
+      <c:overlay val="0"/>
+      <c:spPr>
+        <a:noFill/>
+        <a:ln>
+          <a:noFill/>
+        </a:ln>
+        <a:effectLst/>
+      </c:spPr>
+      <c:txPr>
+        <a:bodyPr rot="0" spcFirstLastPara="1" vertOverflow="ellipsis" vert="horz" wrap="square" anchor="ctr" anchorCtr="1"/>
+        <a:lstStyle/>
+        <a:p>
+          <a:pPr>
+            <a:defRPr sz="900" b="0" i="0" u="none" strike="noStrike" kern="1200" baseline="0">
+              <a:solidFill>
+                <a:schemeClr val="tx1">
+                  <a:lumMod val="65000"/>
+                  <a:lumOff val="35000"/>
+                </a:schemeClr>
+              </a:solidFill>
+              <a:latin typeface="+mn-lt"/>
+              <a:ea typeface="+mn-ea"/>
+              <a:cs typeface="+mn-cs"/>
+            </a:defRPr>
+          </a:pPr>
+          <a:endParaRPr lang="pt-BR"/>
+        </a:p>
+      </c:txPr>
+    </c:legend>
+    <c:plotVisOnly val="1"/>
+    <c:dispBlanksAs val="gap"/>
+    <c:showDLblsOverMax val="0"/>
+    <c:extLst>
+      <c:ext xmlns:c16r3="http://schemas.microsoft.com/office/drawing/2017/03/chart" uri="{56B9EC1D-385E-4148-901F-78D8002777C0}">
+        <c16r3:dataDisplayOptions16>
+          <c16r3:dispNaAsBlank val="1"/>
+        </c16r3:dataDisplayOptions16>
+      </c:ext>
+    </c:extLst>
+  </c:chart>
+  <c:spPr>
+    <a:solidFill>
+      <a:schemeClr val="bg1"/>
+    </a:solidFill>
+    <a:ln w="9525" cap="flat" cmpd="sng" algn="ctr">
+      <a:solidFill>
+        <a:schemeClr val="tx1">
+          <a:lumMod val="15000"/>
+          <a:lumOff val="85000"/>
+        </a:schemeClr>
+      </a:solidFill>
+      <a:round/>
+    </a:ln>
+    <a:effectLst/>
+  </c:spPr>
+  <c:txPr>
+    <a:bodyPr/>
+    <a:lstStyle/>
+    <a:p>
+      <a:pPr>
+        <a:defRPr/>
+      </a:pPr>
+      <a:endParaRPr lang="pt-BR"/>
+    </a:p>
+  </c:txPr>
+  <c:externalData r:id="rId3">
+    <c:autoUpdate val="0"/>
+  </c:externalData>
+</c:chartSpace>
+</file>
+
+<file path=word/charts/colors1.xml><?xml version="1.0" encoding="utf-8"?>
+<cs:colorStyle xmlns:cs="http://schemas.microsoft.com/office/drawing/2012/chartStyle" xmlns:a="http://schemas.openxmlformats.org/drawingml/2006/main" meth="cycle" id="10">
+  <a:schemeClr val="accent1"/>
+  <a:schemeClr val="accent2"/>
+  <a:schemeClr val="accent3"/>
+  <a:schemeClr val="accent4"/>
+  <a:schemeClr val="accent5"/>
+  <a:schemeClr val="accent6"/>
+  <cs:variation/>
+  <cs:variation>
+    <a:lumMod val="60000"/>
+  </cs:variation>
+  <cs:variation>
+    <a:lumMod val="80000"/>
+    <a:lumOff val="20000"/>
+  </cs:variation>
+  <cs:variation>
+    <a:lumMod val="80000"/>
+  </cs:variation>
+  <cs:variation>
+    <a:lumMod val="60000"/>
+    <a:lumOff val="40000"/>
+  </cs:variation>
+  <cs:variation>
+    <a:lumMod val="50000"/>
+  </cs:variation>
+  <cs:variation>
+    <a:lumMod val="70000"/>
+    <a:lumOff val="30000"/>
+  </cs:variation>
+  <cs:variation>
+    <a:lumMod val="70000"/>
+  </cs:variation>
+  <cs:variation>
+    <a:lumMod val="50000"/>
+    <a:lumOff val="50000"/>
+  </cs:variation>
+</cs:colorStyle>
+</file>
+
+<file path=word/charts/style1.xml><?xml version="1.0" encoding="utf-8"?>
+<cs:chartStyle xmlns:cs="http://schemas.microsoft.com/office/drawing/2012/chartStyle" xmlns:a="http://schemas.openxmlformats.org/drawingml/2006/main" id="240">
+  <cs:axisTitle>
+    <cs:lnRef idx="0"/>
+    <cs:fillRef idx="0"/>
+    <cs:effectRef idx="0"/>
+    <cs:fontRef idx="minor">
+      <a:schemeClr val="tx1">
+        <a:lumMod val="65000"/>
+        <a:lumOff val="35000"/>
+      </a:schemeClr>
+    </cs:fontRef>
+    <cs:defRPr sz="1000" kern="1200"/>
+  </cs:axisTitle>
+  <cs:categoryAxis>
+    <cs:lnRef idx="0"/>
+    <cs:fillRef idx="0"/>
+    <cs:effectRef idx="0"/>
+    <cs:fontRef idx="minor">
+      <a:schemeClr val="tx1">
+        <a:lumMod val="65000"/>
+        <a:lumOff val="35000"/>
+      </a:schemeClr>
+    </cs:fontRef>
+    <cs:spPr>
+      <a:ln w="9525" cap="flat" cmpd="sng" algn="ctr">
+        <a:solidFill>
+          <a:schemeClr val="tx1">
+            <a:lumMod val="25000"/>
+            <a:lumOff val="75000"/>
+          </a:schemeClr>
+        </a:solidFill>
+        <a:round/>
+      </a:ln>
+    </cs:spPr>
+    <cs:defRPr sz="900" kern="1200"/>
+  </cs:categoryAxis>
+  <cs:chartArea mods="allowNoFillOverride allowNoLineOverride">
+    <cs:lnRef idx="0"/>
+    <cs:fillRef idx="0"/>
+    <cs:effectRef idx="0"/>
+    <cs:fontRef idx="minor">
+      <a:schemeClr val="tx1"/>
+    </cs:fontRef>
+    <cs:spPr>
+      <a:solidFill>
+        <a:schemeClr val="bg1"/>
+      </a:solidFill>
+      <a:ln w="9525" cap="flat" cmpd="sng" algn="ctr">
+        <a:solidFill>
+          <a:schemeClr val="tx1">
+            <a:lumMod val="15000"/>
+            <a:lumOff val="85000"/>
+          </a:schemeClr>
+        </a:solidFill>
+        <a:round/>
+      </a:ln>
+    </cs:spPr>
+    <cs:defRPr sz="1000" kern="1200"/>
+  </cs:chartArea>
+  <cs:dataLabel>
+    <cs:lnRef idx="0"/>
+    <cs:fillRef idx="0"/>
+    <cs:effectRef idx="0"/>
+    <cs:fontRef idx="minor">
+      <a:schemeClr val="tx1">
+        <a:lumMod val="75000"/>
+        <a:lumOff val="25000"/>
+      </a:schemeClr>
+    </cs:fontRef>
+    <cs:defRPr sz="900" kern="1200"/>
+  </cs:dataLabel>
+  <cs:dataLabelCallout>
+    <cs:lnRef idx="0"/>
+    <cs:fillRef idx="0"/>
+    <cs:effectRef idx="0"/>
+    <cs:fontRef idx="minor">
+      <a:schemeClr val="dk1">
+        <a:lumMod val="65000"/>
+        <a:lumOff val="35000"/>
+      </a:schemeClr>
+    </cs:fontRef>
+    <cs:spPr>
+      <a:solidFill>
+        <a:schemeClr val="lt1"/>
+      </a:solidFill>
+      <a:ln>
+        <a:solidFill>
+          <a:schemeClr val="dk1">
+            <a:lumMod val="25000"/>
+            <a:lumOff val="75000"/>
+          </a:schemeClr>
+        </a:solidFill>
+      </a:ln>
+    </cs:spPr>
+    <cs:defRPr sz="900" kern="1200"/>
+    <cs:bodyPr rot="0" spcFirstLastPara="1" vertOverflow="clip" horzOverflow="clip" vert="horz" wrap="square" lIns="36576" tIns="18288" rIns="36576" bIns="18288" anchor="ctr" anchorCtr="1">
+      <a:spAutoFit/>
+    </cs:bodyPr>
+  </cs:dataLabelCallout>
+  <cs:dataPoint>
+    <cs:lnRef idx="0"/>
+    <cs:fillRef idx="1">
+      <cs:styleClr val="auto"/>
+    </cs:fillRef>
+    <cs:effectRef idx="0"/>
+    <cs:fontRef idx="minor">
+      <a:schemeClr val="tx1"/>
+    </cs:fontRef>
+  </cs:dataPoint>
+  <cs:dataPoint3D>
+    <cs:lnRef idx="0"/>
+    <cs:fillRef idx="1">
+      <cs:styleClr val="auto"/>
+    </cs:fillRef>
+    <cs:effectRef idx="0"/>
+    <cs:fontRef idx="minor">
+      <a:schemeClr val="tx1"/>
+    </cs:fontRef>
+  </cs:dataPoint3D>
+  <cs:dataPointLine>
+    <cs:lnRef idx="0">
+      <cs:styleClr val="auto"/>
+    </cs:lnRef>
+    <cs:fillRef idx="1"/>
+    <cs:effectRef idx="0"/>
+    <cs:fontRef idx="minor">
+      <a:schemeClr val="tx1"/>
+    </cs:fontRef>
+    <cs:spPr>
+      <a:ln w="19050" cap="rnd">
+        <a:solidFill>
+          <a:schemeClr val="phClr"/>
+        </a:solidFill>
+        <a:round/>
+      </a:ln>
+    </cs:spPr>
+  </cs:dataPointLine>
+  <cs:dataPointMarker>
+    <cs:lnRef idx="0">
+      <cs:styleClr val="auto"/>
+    </cs:lnRef>
+    <cs:fillRef idx="1">
+      <cs:styleClr val="auto"/>
+    </cs:fillRef>
+    <cs:effectRef idx="0"/>
+    <cs:fontRef idx="minor">
+      <a:schemeClr val="tx1"/>
+    </cs:fontRef>
+    <cs:spPr>
+      <a:ln w="9525">
+        <a:solidFill>
+          <a:schemeClr val="phClr"/>
+        </a:solidFill>
+      </a:ln>
+    </cs:spPr>
+  </cs:dataPointMarker>
+  <cs:dataPointMarkerLayout symbol="circle" size="5"/>
+  <cs:dataPointWireframe>
+    <cs:lnRef idx="0">
+      <cs:styleClr val="auto"/>
+    </cs:lnRef>
+    <cs:fillRef idx="0"/>
+    <cs:effectRef idx="0"/>
+    <cs:fontRef idx="minor">
+      <a:schemeClr val="dk1"/>
+    </cs:fontRef>
+    <cs:spPr>
+      <a:ln w="9525" cap="rnd">
+        <a:solidFill>
+          <a:schemeClr val="phClr"/>
+        </a:solidFill>
+        <a:round/>
+      </a:ln>
+    </cs:spPr>
+  </cs:dataPointWireframe>
+  <cs:dataTable>
+    <cs:lnRef idx="0"/>
+    <cs:fillRef idx="0"/>
+    <cs:effectRef idx="0"/>
+    <cs:fontRef idx="minor">
+      <a:schemeClr val="tx1">
+        <a:lumMod val="65000"/>
+        <a:lumOff val="35000"/>
+      </a:schemeClr>
+    </cs:fontRef>
+    <cs:spPr>
+      <a:noFill/>
+      <a:ln w="9525" cap="flat" cmpd="sng" algn="ctr">
+        <a:solidFill>
+          <a:schemeClr val="tx1">
+            <a:lumMod val="15000"/>
+            <a:lumOff val="85000"/>
+          </a:schemeClr>
+        </a:solidFill>
+        <a:round/>
+      </a:ln>
+    </cs:spPr>
+    <cs:defRPr sz="900" kern="1200"/>
+  </cs:dataTable>
+  <cs:downBar>
+    <cs:lnRef idx="0"/>
+    <cs:fillRef idx="0"/>
+    <cs:effectRef idx="0"/>
+    <cs:fontRef idx="minor">
+      <a:schemeClr val="tx1"/>
+    </cs:fontRef>
+    <cs:spPr>
+      <a:solidFill>
+        <a:schemeClr val="dk1">
+          <a:lumMod val="75000"/>
+          <a:lumOff val="25000"/>
+        </a:schemeClr>
+      </a:solidFill>
+      <a:ln w="9525" cap="flat" cmpd="sng" algn="ctr">
+        <a:solidFill>
+          <a:schemeClr val="tx1">
+            <a:lumMod val="65000"/>
+            <a:lumOff val="35000"/>
+          </a:schemeClr>
+        </a:solidFill>
+        <a:round/>
+      </a:ln>
+    </cs:spPr>
+  </cs:downBar>
+  <cs:dropLine>
+    <cs:lnRef idx="0"/>
+    <cs:fillRef idx="0"/>
+    <cs:effectRef idx="0"/>
+    <cs:fontRef idx="minor">
+      <a:schemeClr val="tx1"/>
+    </cs:fontRef>
+    <cs:spPr>
+      <a:ln w="9525" cap="flat" cmpd="sng" algn="ctr">
+        <a:solidFill>
+          <a:schemeClr val="tx1">
+            <a:lumMod val="35000"/>
+            <a:lumOff val="65000"/>
+          </a:schemeClr>
+        </a:solidFill>
+        <a:round/>
+      </a:ln>
+    </cs:spPr>
+  </cs:dropLine>
+  <cs:errorBar>
+    <cs:lnRef idx="0"/>
+    <cs:fillRef idx="0"/>
+    <cs:effectRef idx="0"/>
+    <cs:fontRef idx="minor">
+      <a:schemeClr val="tx1"/>
+    </cs:fontRef>
+    <cs:spPr>
+      <a:ln w="9525" cap="flat" cmpd="sng" algn="ctr">
+        <a:solidFill>
+          <a:schemeClr val="tx1">
+            <a:lumMod val="65000"/>
+            <a:lumOff val="35000"/>
+          </a:schemeClr>
+        </a:solidFill>
+        <a:round/>
+      </a:ln>
+    </cs:spPr>
+  </cs:errorBar>
+  <cs:floor>
+    <cs:lnRef idx="0"/>
+    <cs:fillRef idx="0"/>
+    <cs:effectRef idx="0"/>
+    <cs:fontRef idx="minor">
+      <a:schemeClr val="tx1"/>
+    </cs:fontRef>
+    <cs:spPr>
+      <a:noFill/>
+      <a:ln>
+        <a:noFill/>
+      </a:ln>
+    </cs:spPr>
+  </cs:floor>
+  <cs:gridlineMajor>
+    <cs:lnRef idx="0"/>
+    <cs:fillRef idx="0"/>
+    <cs:effectRef idx="0"/>
+    <cs:fontRef idx="minor">
+      <a:schemeClr val="tx1"/>
+    </cs:fontRef>
+    <cs:spPr>
+      <a:ln w="9525" cap="flat" cmpd="sng" algn="ctr">
+        <a:solidFill>
+          <a:schemeClr val="tx1">
+            <a:lumMod val="15000"/>
+            <a:lumOff val="85000"/>
+          </a:schemeClr>
+        </a:solidFill>
+        <a:round/>
+      </a:ln>
+    </cs:spPr>
+  </cs:gridlineMajor>
+  <cs:gridlineMinor>
+    <cs:lnRef idx="0"/>
+    <cs:fillRef idx="0"/>
+    <cs:effectRef idx="0"/>
+    <cs:fontRef idx="minor">
+      <a:schemeClr val="tx1"/>
+    </cs:fontRef>
+    <cs:spPr>
+      <a:ln w="9525" cap="flat" cmpd="sng" algn="ctr">
+        <a:solidFill>
+          <a:schemeClr val="tx1">
+            <a:lumMod val="5000"/>
+            <a:lumOff val="95000"/>
+          </a:schemeClr>
+        </a:solidFill>
+        <a:round/>
+      </a:ln>
+    </cs:spPr>
+  </cs:gridlineMinor>
+  <cs:hiLoLine>
+    <cs:lnRef idx="0"/>
+    <cs:fillRef idx="0"/>
+    <cs:effectRef idx="0"/>
+    <cs:fontRef idx="minor">
+      <a:schemeClr val="tx1"/>
+    </cs:fontRef>
+    <cs:spPr>
+      <a:ln w="9525" cap="flat" cmpd="sng" algn="ctr">
+        <a:solidFill>
+          <a:schemeClr val="tx1">
+            <a:lumMod val="50000"/>
+            <a:lumOff val="50000"/>
+          </a:schemeClr>
+        </a:solidFill>
+        <a:round/>
+      </a:ln>
+    </cs:spPr>
+  </cs:hiLoLine>
+  <cs:leaderLine>
+    <cs:lnRef idx="0"/>
+    <cs:fillRef idx="0"/>
+    <cs:effectRef idx="0"/>
+    <cs:fontRef idx="minor">
+      <a:schemeClr val="tx1"/>
+    </cs:fontRef>
+    <cs:spPr>
+      <a:ln w="9525" cap="flat" cmpd="sng" algn="ctr">
+        <a:solidFill>
+          <a:schemeClr val="tx1">
+            <a:lumMod val="35000"/>
+            <a:lumOff val="65000"/>
+          </a:schemeClr>
+        </a:solidFill>
+        <a:round/>
+      </a:ln>
+    </cs:spPr>
+  </cs:leaderLine>
+  <cs:legend>
+    <cs:lnRef idx="0"/>
+    <cs:fillRef idx="0"/>
+    <cs:effectRef idx="0"/>
+    <cs:fontRef idx="minor">
+      <a:schemeClr val="tx1">
+        <a:lumMod val="65000"/>
+        <a:lumOff val="35000"/>
+      </a:schemeClr>
+    </cs:fontRef>
+    <cs:defRPr sz="900" kern="1200"/>
+  </cs:legend>
+  <cs:plotArea mods="allowNoFillOverride allowNoLineOverride">
+    <cs:lnRef idx="0"/>
+    <cs:fillRef idx="0"/>
+    <cs:effectRef idx="0"/>
+    <cs:fontRef idx="minor">
+      <a:schemeClr val="tx1"/>
+    </cs:fontRef>
+  </cs:plotArea>
+  <cs:plotArea3D mods="allowNoFillOverride allowNoLineOverride">
+    <cs:lnRef idx="0"/>
+    <cs:fillRef idx="0"/>
+    <cs:effectRef idx="0"/>
+    <cs:fontRef idx="minor">
+      <a:schemeClr val="tx1"/>
+    </cs:fontRef>
+  </cs:plotArea3D>
+  <cs:seriesAxis>
+    <cs:lnRef idx="0"/>
+    <cs:fillRef idx="0"/>
+    <cs:effectRef idx="0"/>
+    <cs:fontRef idx="minor">
+      <a:schemeClr val="tx1">
+        <a:lumMod val="65000"/>
+        <a:lumOff val="35000"/>
+      </a:schemeClr>
+    </cs:fontRef>
+    <cs:defRPr sz="900" kern="1200"/>
+  </cs:seriesAxis>
+  <cs:seriesLine>
+    <cs:lnRef idx="0"/>
+    <cs:fillRef idx="0"/>
+    <cs:effectRef idx="0"/>
+    <cs:fontRef idx="minor">
+      <a:schemeClr val="tx1"/>
+    </cs:fontRef>
+    <cs:spPr>
+      <a:ln w="9525" cap="flat" cmpd="sng" algn="ctr">
+        <a:solidFill>
+          <a:schemeClr val="tx1">
+            <a:lumMod val="35000"/>
+            <a:lumOff val="65000"/>
+          </a:schemeClr>
+        </a:solidFill>
+        <a:round/>
+      </a:ln>
+    </cs:spPr>
+  </cs:seriesLine>
+  <cs:title>
+    <cs:lnRef idx="0"/>
+    <cs:fillRef idx="0"/>
+    <cs:effectRef idx="0"/>
+    <cs:fontRef idx="minor">
+      <a:schemeClr val="tx1">
+        <a:lumMod val="65000"/>
+        <a:lumOff val="35000"/>
+      </a:schemeClr>
+    </cs:fontRef>
+    <cs:defRPr sz="1400" b="0" kern="1200" spc="0" baseline="0"/>
+  </cs:title>
+  <cs:trendline>
+    <cs:lnRef idx="0">
+      <cs:styleClr val="auto"/>
+    </cs:lnRef>
+    <cs:fillRef idx="0"/>
+    <cs:effectRef idx="0"/>
+    <cs:fontRef idx="minor">
+      <a:schemeClr val="tx1"/>
+    </cs:fontRef>
+    <cs:spPr>
+      <a:ln w="19050" cap="rnd">
+        <a:solidFill>
+          <a:schemeClr val="phClr"/>
+        </a:solidFill>
+        <a:prstDash val="sysDot"/>
+      </a:ln>
+    </cs:spPr>
+  </cs:trendline>
+  <cs:trendlineLabel>
+    <cs:lnRef idx="0"/>
+    <cs:fillRef idx="0"/>
+    <cs:effectRef idx="0"/>
+    <cs:fontRef idx="minor">
+      <a:schemeClr val="tx1">
+        <a:lumMod val="65000"/>
+        <a:lumOff val="35000"/>
+      </a:schemeClr>
+    </cs:fontRef>
+    <cs:defRPr sz="900" kern="1200"/>
+  </cs:trendlineLabel>
+  <cs:upBar>
+    <cs:lnRef idx="0"/>
+    <cs:fillRef idx="0"/>
+    <cs:effectRef idx="0"/>
+    <cs:fontRef idx="minor">
+      <a:schemeClr val="tx1"/>
+    </cs:fontRef>
+    <cs:spPr>
+      <a:solidFill>
+        <a:schemeClr val="lt1"/>
+      </a:solidFill>
+      <a:ln w="9525" cap="flat" cmpd="sng" algn="ctr">
+        <a:solidFill>
+          <a:schemeClr val="tx1">
+            <a:lumMod val="65000"/>
+            <a:lumOff val="35000"/>
+          </a:schemeClr>
+        </a:solidFill>
+        <a:round/>
+      </a:ln>
+    </cs:spPr>
+  </cs:upBar>
+  <cs:valueAxis>
+    <cs:lnRef idx="0"/>
+    <cs:fillRef idx="0"/>
+    <cs:effectRef idx="0"/>
+    <cs:fontRef idx="minor">
+      <a:schemeClr val="tx1">
+        <a:lumMod val="65000"/>
+        <a:lumOff val="35000"/>
+      </a:schemeClr>
+    </cs:fontRef>
+    <cs:spPr>
+      <a:ln w="9525" cap="flat" cmpd="sng" algn="ctr">
+        <a:solidFill>
+          <a:schemeClr val="tx1">
+            <a:lumMod val="25000"/>
+            <a:lumOff val="75000"/>
+          </a:schemeClr>
+        </a:solidFill>
+        <a:round/>
+      </a:ln>
+    </cs:spPr>
+    <cs:defRPr sz="900" kern="1200"/>
+  </cs:valueAxis>
+  <cs:wall>
+    <cs:lnRef idx="0"/>
+    <cs:fillRef idx="0"/>
+    <cs:effectRef idx="0"/>
+    <cs:fontRef idx="minor">
+      <a:schemeClr val="tx1"/>
+    </cs:fontRef>
+    <cs:spPr>
+      <a:noFill/>
+      <a:ln>
+        <a:noFill/>
+      </a:ln>
+    </cs:spPr>
+  </cs:wall>
+</cs:chartStyle>
+</file>
+
 <file path=word/theme/theme1.xml><?xml version="1.0" encoding="utf-8"?>
 <a:theme xmlns:a="http://schemas.openxmlformats.org/drawingml/2006/main" name="Tema do Office">
   <a:themeElements>

</xml_diff>

<commit_message>
Adiciona a seção de Conclusão ao relatório e ajusta espaçamento das tabelas
Conclusão amarra a relação da Seção 2 com os ganhos de desempenho da
Seção 4, confirma os resultados da Seção 5 e propõe um crivo de
divisores ímpares como possível melhoria futura. Também centraliza as
três tabelas na página e ajusta o espaçamento antes/depois delas e do
gráfico, mantendo cada tabela e seu texto de introdução na mesma
região da página.

Co-Authored-By: Claude Sonnet 5 <noreply@anthropic.com>
</commit_message>
<xml_diff>
--- a/Trabalho1/relatorio-trabalho1.docx
+++ b/Trabalho1/relatorio-trabalho1.docx
@@ -610,12 +610,16 @@
       </w:r>
     </w:p>
     <w:p>
+      <w:pPr>
+        <w:keepNext/>
+      </w:pPr>
       <w:r>
         <w:t>Exemplo de funcionamento, para n = 15:</w:t>
       </w:r>
     </w:p>
     <w:p>
       <w:pPr>
+        <w:spacing w:before="240"/>
         <w:keepNext/>
         <w:jc w:val="center"/>
       </w:pPr>
@@ -630,6 +634,7 @@
     </w:p>
     <w:tbl>
       <w:tblPr>
+        <w:jc w:val="center"/>
         <w:tblW w:w="8504" w:type="dxa"/>
         <w:tblBorders>
           <w:top w:val="single" w:sz="4" w:space="0" w:color="auto"/>
@@ -1246,12 +1251,16 @@
       </w:r>
     </w:p>
     <w:p>
+      <w:pPr>
+        <w:keepNext/>
+      </w:pPr>
       <w:r>
         <w:t>Para comparar as duas versões na prática, ambas foram executadas sobre faixas pequenas (de 500 até 32.000 — acima disso a versão ingênua estoura a pilha, como dito na Seção 3):</w:t>
       </w:r>
     </w:p>
     <w:p>
       <w:pPr>
+        <w:spacing w:before="240"/>
         <w:keepNext/>
         <w:jc w:val="center"/>
       </w:pPr>
@@ -1265,6 +1274,7 @@
     </w:p>
     <w:tbl>
       <w:tblPr>
+        <w:jc w:val="center"/>
         <w:tblW w:w="8504" w:type="dxa"/>
         <w:tblBorders>
           <w:top w:val="single" w:sz="4" w:space="0" w:color="auto"/>
@@ -1689,6 +1699,9 @@
       </w:tr>
     </w:tbl>
     <w:p>
+      <w:pPr>
+        <w:spacing w:before="240"/>
+      </w:pPr>
       <w:r>
         <w:lastRenderedPageBreak/>
         <w:t>Para os tamanhos menores (500 e 1.000), o tempo da versão final é tão pequeno que passa a ser dominado por ruído de medição da própria JVM, e não pelo algoritmo em si — por isso ele não cresce de forma perfeitamente suave logo no início do gráfico abaixo.</w:t>
@@ -1696,6 +1709,7 @@
     </w:p>
     <w:p>
       <w:pPr>
+        <w:keepNext/>
         <w:spacing w:before="240" w:after="240"/>
         <w:jc w:val="center"/>
       </w:pPr>
@@ -1737,8 +1751,687 @@
       </w:r>
     </w:p>
     <w:p>
+      <w:pPr>
+        <w:spacing w:before="240"/>
+      </w:pPr>
       <w:r>
         <w:t>Com a versão final, as sete faixas pedidas pelo enunciado — a maior delas indo de 1.500.000 até 2.000.000 — foram resolvidas em cerca de 9,1 segundos no total (detalhes por faixa na Seção 5), o que mostra que a solução escala bem para o tamanho real do problema.</w:t>
+      </w:r>
+    </w:p>
+    <w:p>
+      <w:pPr>
+        <w:pStyle w:val="Ttulo1"/>
+      </w:pPr>
+      <w:r>
+        <w:t>5. Resultados</w:t>
+      </w:r>
+    </w:p>
+    <w:p>
+      <w:pPr>
+        <w:keepNext/>
+      </w:pPr>
+      <w:r>
+        <w:t>Aplicando o algoritmo da Seção 3 às sete faixas pedidas pelo enunciado, chegamos aos seguintes resultados:</w:t>
+      </w:r>
+    </w:p>
+    <w:p>
+      <w:pPr>
+        <w:spacing w:before="240"/>
+        <w:keepNext/>
+        <w:jc w:val="center"/>
+      </w:pPr>
+      <w:r>
+        <w:rPr>
+          <w:i/>
+          <w:sz w:val="20"/>
+        </w:rPr>
+        <w:t>Tabela 3 – Resultados das sete faixas pedidas pelo enunciado</w:t>
+      </w:r>
+    </w:p>
+    <w:tbl>
+      <w:tblPr>
+        <w:tblStyle w:val="Tabelanormal"/>
+        <w:jc w:val="center"/>
+        <w:tblW w:w="9504" w:type="dxa"/>
+        <w:tblBorders>
+          <w:top w:val="single" w:sz="4" w:space="0" w:color="auto"/>
+          <w:left w:val="single" w:sz="4" w:space="0" w:color="auto"/>
+          <w:bottom w:val="single" w:sz="4" w:space="0" w:color="auto"/>
+          <w:right w:val="single" w:sz="4" w:space="0" w:color="auto"/>
+          <w:insideH w:val="single" w:sz="4" w:space="0" w:color="auto"/>
+          <w:insideV w:val="single" w:sz="4" w:space="0" w:color="auto"/>
+        </w:tblBorders>
+      </w:tblPr>
+      <w:tblGrid>
+        <w:gridCol w:w="2200"/>
+        <w:gridCol w:w="2200"/>
+        <w:gridCol w:w="3204"/>
+        <w:gridCol w:w="1900"/>
+      </w:tblGrid>
+      <w:tr>
+        <w:trPr>
+          <w:cantSplit/>
+        </w:trPr>
+        <w:tc>
+          <w:tcPr>
+            <w:tcW w:w="2200" w:type="dxa"/>
+            <w:vAlign w:val="center"/>
+          </w:tcPr>
+          <w:p>
+            <w:pPr>
+              <w:keepNext/>
+              <w:jc w:val="center"/>
+            </w:pPr>
+            <w:r>
+              <w:rPr>
+                <w:b/>
+              </w:rPr>
+              <w:t>Faixa</w:t>
+            </w:r>
+          </w:p>
+        </w:tc>
+        <w:tc>
+          <w:tcPr>
+            <w:tcW w:w="2200" w:type="dxa"/>
+            <w:vAlign w:val="center"/>
+          </w:tcPr>
+          <w:p>
+            <w:pPr>
+              <w:keepNext/>
+              <w:jc w:val="center"/>
+            </w:pPr>
+            <w:r>
+              <w:rPr>
+                <w:b/>
+              </w:rPr>
+              <w:t>Maior nº de decomposições</w:t>
+            </w:r>
+          </w:p>
+        </w:tc>
+        <w:tc>
+          <w:tcPr>
+            <w:tcW w:w="3204" w:type="dxa"/>
+            <w:vAlign w:val="center"/>
+          </w:tcPr>
+          <w:p>
+            <w:pPr>
+              <w:keepNext/>
+              <w:jc w:val="center"/>
+            </w:pPr>
+            <w:r>
+              <w:rPr>
+                <w:b/>
+              </w:rPr>
+              <w:t>Vencedores</w:t>
+            </w:r>
+          </w:p>
+        </w:tc>
+        <w:tc>
+          <w:tcPr>
+            <w:tcW w:w="1900" w:type="dxa"/>
+            <w:vAlign w:val="center"/>
+          </w:tcPr>
+          <w:p>
+            <w:pPr>
+              <w:keepNext/>
+              <w:jc w:val="center"/>
+            </w:pPr>
+            <w:r>
+              <w:rPr>
+                <w:b/>
+              </w:rPr>
+              <w:t>Tempo</w:t>
+            </w:r>
+          </w:p>
+        </w:tc>
+      </w:tr>
+      <w:tr>
+        <w:trPr>
+          <w:cantSplit/>
+        </w:trPr>
+        <w:tc>
+          <w:tcPr>
+            <w:tcW w:w="2200" w:type="dxa"/>
+            <w:vAlign w:val="center"/>
+          </w:tcPr>
+          <w:p>
+            <w:pPr>
+              <w:keepNext/>
+              <w:jc w:val="center"/>
+            </w:pPr>
+            <w:r>
+              <w:t>2 – 100.000</w:t>
+            </w:r>
+          </w:p>
+        </w:tc>
+        <w:tc>
+          <w:tcPr>
+            <w:tcW w:w="2200" w:type="dxa"/>
+            <w:vAlign w:val="center"/>
+          </w:tcPr>
+          <w:p>
+            <w:pPr>
+              <w:keepNext/>
+              <w:jc w:val="center"/>
+            </w:pPr>
+            <w:r>
+              <w:t>48</w:t>
+            </w:r>
+          </w:p>
+        </w:tc>
+        <w:tc>
+          <w:tcPr>
+            <w:tcW w:w="3204" w:type="dxa"/>
+            <w:vAlign w:val="center"/>
+          </w:tcPr>
+          <w:p>
+            <w:pPr>
+              <w:keepNext/>
+              <w:jc w:val="center"/>
+            </w:pPr>
+            <w:r>
+              <w:t>19 números (lista abaixo)</w:t>
+            </w:r>
+          </w:p>
+        </w:tc>
+        <w:tc>
+          <w:tcPr>
+            <w:tcW w:w="1900" w:type="dxa"/>
+            <w:vAlign w:val="center"/>
+          </w:tcPr>
+          <w:p>
+            <w:pPr>
+              <w:keepNext/>
+              <w:jc w:val="center"/>
+            </w:pPr>
+            <w:r>
+              <w:t>0,097s</w:t>
+            </w:r>
+          </w:p>
+        </w:tc>
+      </w:tr>
+      <w:tr>
+        <w:trPr>
+          <w:cantSplit/>
+        </w:trPr>
+        <w:tc>
+          <w:tcPr>
+            <w:tcW w:w="2200" w:type="dxa"/>
+            <w:vAlign w:val="center"/>
+          </w:tcPr>
+          <w:p>
+            <w:pPr>
+              <w:keepNext/>
+              <w:jc w:val="center"/>
+            </w:pPr>
+            <w:r>
+              <w:t>100.000 – 200.000</w:t>
+            </w:r>
+          </w:p>
+        </w:tc>
+        <w:tc>
+          <w:tcPr>
+            <w:tcW w:w="2200" w:type="dxa"/>
+            <w:vAlign w:val="center"/>
+          </w:tcPr>
+          <w:p>
+            <w:pPr>
+              <w:keepNext/>
+              <w:jc w:val="center"/>
+            </w:pPr>
+            <w:r>
+              <w:t>64</w:t>
+            </w:r>
+          </w:p>
+        </w:tc>
+        <w:tc>
+          <w:tcPr>
+            <w:tcW w:w="3204" w:type="dxa"/>
+            <w:vAlign w:val="center"/>
+          </w:tcPr>
+          <w:p>
+            <w:pPr>
+              <w:keepNext/>
+              <w:jc w:val="center"/>
+            </w:pPr>
+            <w:r>
+              <w:t>135135, 176715, 197505</w:t>
+            </w:r>
+          </w:p>
+        </w:tc>
+        <w:tc>
+          <w:tcPr>
+            <w:tcW w:w="1900" w:type="dxa"/>
+            <w:vAlign w:val="center"/>
+          </w:tcPr>
+          <w:p>
+            <w:pPr>
+              <w:keepNext/>
+              <w:jc w:val="center"/>
+            </w:pPr>
+            <w:r>
+              <w:t>0,181s</w:t>
+            </w:r>
+          </w:p>
+        </w:tc>
+      </w:tr>
+      <w:tr>
+        <w:trPr>
+          <w:cantSplit/>
+        </w:trPr>
+        <w:tc>
+          <w:tcPr>
+            <w:tcW w:w="2200" w:type="dxa"/>
+            <w:vAlign w:val="center"/>
+          </w:tcPr>
+          <w:p>
+            <w:pPr>
+              <w:keepNext/>
+              <w:jc w:val="center"/>
+            </w:pPr>
+            <w:r>
+              <w:t>200.000 – 400.000</w:t>
+            </w:r>
+          </w:p>
+        </w:tc>
+        <w:tc>
+          <w:tcPr>
+            <w:tcW w:w="2200" w:type="dxa"/>
+            <w:vAlign w:val="center"/>
+          </w:tcPr>
+          <w:p>
+            <w:pPr>
+              <w:keepNext/>
+              <w:jc w:val="center"/>
+            </w:pPr>
+            <w:r>
+              <w:t>72</w:t>
+            </w:r>
+          </w:p>
+        </w:tc>
+        <w:tc>
+          <w:tcPr>
+            <w:tcW w:w="3204" w:type="dxa"/>
+            <w:vAlign w:val="center"/>
+          </w:tcPr>
+          <w:p>
+            <w:pPr>
+              <w:keepNext/>
+              <w:jc w:val="center"/>
+            </w:pPr>
+            <w:r>
+              <w:t>8 números (lista abaixo)</w:t>
+            </w:r>
+          </w:p>
+        </w:tc>
+        <w:tc>
+          <w:tcPr>
+            <w:tcW w:w="1900" w:type="dxa"/>
+            <w:vAlign w:val="center"/>
+          </w:tcPr>
+          <w:p>
+            <w:pPr>
+              <w:keepNext/>
+              <w:jc w:val="center"/>
+            </w:pPr>
+            <w:r>
+              <w:t>0,518s</w:t>
+            </w:r>
+          </w:p>
+        </w:tc>
+      </w:tr>
+      <w:tr>
+        <w:trPr>
+          <w:cantSplit/>
+        </w:trPr>
+        <w:tc>
+          <w:tcPr>
+            <w:tcW w:w="2200" w:type="dxa"/>
+            <w:vAlign w:val="center"/>
+          </w:tcPr>
+          <w:p>
+            <w:pPr>
+              <w:keepNext/>
+              <w:jc w:val="center"/>
+            </w:pPr>
+            <w:r>
+              <w:t>400.000 – 800.000</w:t>
+            </w:r>
+          </w:p>
+        </w:tc>
+        <w:tc>
+          <w:tcPr>
+            <w:tcW w:w="2200" w:type="dxa"/>
+            <w:vAlign w:val="center"/>
+          </w:tcPr>
+          <w:p>
+            <w:pPr>
+              <w:keepNext/>
+              <w:jc w:val="center"/>
+            </w:pPr>
+            <w:r>
+              <w:t>96</w:t>
+            </w:r>
+          </w:p>
+        </w:tc>
+        <w:tc>
+          <w:tcPr>
+            <w:tcW w:w="3204" w:type="dxa"/>
+            <w:vAlign w:val="center"/>
+          </w:tcPr>
+          <w:p>
+            <w:pPr>
+              <w:keepNext/>
+              <w:jc w:val="center"/>
+            </w:pPr>
+            <w:r>
+              <w:t>675675, 765765</w:t>
+            </w:r>
+          </w:p>
+        </w:tc>
+        <w:tc>
+          <w:tcPr>
+            <w:tcW w:w="1900" w:type="dxa"/>
+            <w:vAlign w:val="center"/>
+          </w:tcPr>
+          <w:p>
+            <w:pPr>
+              <w:keepNext/>
+              <w:jc w:val="center"/>
+            </w:pPr>
+            <w:r>
+              <w:t>1,489s</w:t>
+            </w:r>
+          </w:p>
+        </w:tc>
+      </w:tr>
+      <w:tr>
+        <w:trPr>
+          <w:cantSplit/>
+        </w:trPr>
+        <w:tc>
+          <w:tcPr>
+            <w:tcW w:w="2200" w:type="dxa"/>
+            <w:vAlign w:val="center"/>
+          </w:tcPr>
+          <w:p>
+            <w:pPr>
+              <w:keepNext/>
+              <w:jc w:val="center"/>
+            </w:pPr>
+            <w:r>
+              <w:t>800.000 – 1.000.000</w:t>
+            </w:r>
+          </w:p>
+        </w:tc>
+        <w:tc>
+          <w:tcPr>
+            <w:tcW w:w="2200" w:type="dxa"/>
+            <w:vAlign w:val="center"/>
+          </w:tcPr>
+          <w:p>
+            <w:pPr>
+              <w:keepNext/>
+              <w:jc w:val="center"/>
+            </w:pPr>
+            <w:r>
+              <w:t>96</w:t>
+            </w:r>
+          </w:p>
+        </w:tc>
+        <w:tc>
+          <w:tcPr>
+            <w:tcW w:w="3204" w:type="dxa"/>
+            <w:vAlign w:val="center"/>
+          </w:tcPr>
+          <w:p>
+            <w:pPr>
+              <w:keepNext/>
+              <w:jc w:val="center"/>
+            </w:pPr>
+            <w:r>
+              <w:t>855855, 883575, 945945, 987525</w:t>
+            </w:r>
+          </w:p>
+        </w:tc>
+        <w:tc>
+          <w:tcPr>
+            <w:tcW w:w="1900" w:type="dxa"/>
+            <w:vAlign w:val="center"/>
+          </w:tcPr>
+          <w:p>
+            <w:pPr>
+              <w:keepNext/>
+              <w:jc w:val="center"/>
+            </w:pPr>
+            <w:r>
+              <w:t>0,920s</w:t>
+            </w:r>
+          </w:p>
+        </w:tc>
+      </w:tr>
+      <w:tr>
+        <w:trPr>
+          <w:cantSplit/>
+        </w:trPr>
+        <w:tc>
+          <w:tcPr>
+            <w:tcW w:w="2200" w:type="dxa"/>
+            <w:vAlign w:val="center"/>
+          </w:tcPr>
+          <w:p>
+            <w:pPr>
+              <w:keepNext/>
+              <w:jc w:val="center"/>
+            </w:pPr>
+            <w:r>
+              <w:t>1.000.000 – 1.500.000</w:t>
+            </w:r>
+          </w:p>
+        </w:tc>
+        <w:tc>
+          <w:tcPr>
+            <w:tcW w:w="2200" w:type="dxa"/>
+            <w:vAlign w:val="center"/>
+          </w:tcPr>
+          <w:p>
+            <w:pPr>
+              <w:keepNext/>
+              <w:jc w:val="center"/>
+            </w:pPr>
+            <w:r>
+              <w:t>96</w:t>
+            </w:r>
+          </w:p>
+        </w:tc>
+        <w:tc>
+          <w:tcPr>
+            <w:tcW w:w="3204" w:type="dxa"/>
+            <w:vAlign w:val="center"/>
+          </w:tcPr>
+          <w:p>
+            <w:pPr>
+              <w:keepNext/>
+              <w:jc w:val="center"/>
+            </w:pPr>
+            <w:r>
+              <w:t>20 números (lista abaixo)</w:t>
+            </w:r>
+          </w:p>
+        </w:tc>
+        <w:tc>
+          <w:tcPr>
+            <w:tcW w:w="1900" w:type="dxa"/>
+            <w:vAlign w:val="center"/>
+          </w:tcPr>
+          <w:p>
+            <w:pPr>
+              <w:keepNext/>
+              <w:jc w:val="center"/>
+            </w:pPr>
+            <w:r>
+              <w:t>2,716s</w:t>
+            </w:r>
+          </w:p>
+        </w:tc>
+      </w:tr>
+      <w:tr>
+        <w:trPr>
+          <w:cantSplit/>
+        </w:trPr>
+        <w:tc>
+          <w:tcPr>
+            <w:tcW w:w="2200" w:type="dxa"/>
+            <w:vAlign w:val="center"/>
+          </w:tcPr>
+          <w:p>
+            <w:pPr>
+              <w:jc w:val="center"/>
+            </w:pPr>
+            <w:r>
+              <w:t>1.500.000 – 2.000.000</w:t>
+            </w:r>
+          </w:p>
+        </w:tc>
+        <w:tc>
+          <w:tcPr>
+            <w:tcW w:w="2200" w:type="dxa"/>
+            <w:vAlign w:val="center"/>
+          </w:tcPr>
+          <w:p>
+            <w:pPr>
+              <w:jc w:val="center"/>
+            </w:pPr>
+            <w:r>
+              <w:t>108</w:t>
+            </w:r>
+          </w:p>
+        </w:tc>
+        <w:tc>
+          <w:tcPr>
+            <w:tcW w:w="3204" w:type="dxa"/>
+            <w:vAlign w:val="center"/>
+          </w:tcPr>
+          <w:p>
+            <w:pPr>
+              <w:jc w:val="center"/>
+            </w:pPr>
+            <w:r>
+              <w:t>1576575</w:t>
+            </w:r>
+          </w:p>
+        </w:tc>
+        <w:tc>
+          <w:tcPr>
+            <w:tcW w:w="1900" w:type="dxa"/>
+            <w:vAlign w:val="center"/>
+          </w:tcPr>
+          <w:p>
+            <w:pPr>
+              <w:jc w:val="center"/>
+            </w:pPr>
+            <w:r>
+              <w:t>3,216s</w:t>
+            </w:r>
+          </w:p>
+        </w:tc>
+      </w:tr>
+    </w:tbl>
+    <w:p>
+      <w:pPr>
+        <w:spacing w:before="240"/>
+      </w:pPr>
+      <w:r>
+        <w:t>Vencedores completos das faixas com mais de um resultado:</w:t>
+      </w:r>
+    </w:p>
+    <w:p>
+      <w:pPr>
+        <w:ind w:left="720" w:hanging="360"/>
+      </w:pPr>
+      <w:r>
+        <w:t>• </w:t>
+      </w:r>
+      <w:r>
+        <w:rPr>
+          <w:b/>
+        </w:rPr>
+        <w:t>2 – 100.000 (48): </w:t>
+      </w:r>
+      <w:r>
+        <w:t>45045, 51975, 58905, 61425, 65835, 69615, 72765, 75075, 77805, 79695, 80325, 85995, 86625, 89775, 90090, 93555, 94185, 96525, 98175</w:t>
+      </w:r>
+    </w:p>
+    <w:p>
+      <w:pPr>
+        <w:ind w:left="720" w:hanging="360"/>
+      </w:pPr>
+      <w:r>
+        <w:t>• </w:t>
+      </w:r>
+      <w:r>
+        <w:rPr>
+          <w:b/>
+        </w:rPr>
+        <w:t>200.000 – 400.000 (72): </w:t>
+      </w:r>
+      <w:r>
+        <w:t>225225, 294525, 315315, 329175, 348075, 363825, 389025, 398475</w:t>
+      </w:r>
+    </w:p>
+    <w:p>
+      <w:pPr>
+        <w:ind w:left="720" w:hanging="360"/>
+      </w:pPr>
+      <w:r>
+        <w:t>• </w:t>
+      </w:r>
+      <w:r>
+        <w:rPr>
+          <w:b/>
+        </w:rPr>
+        <w:t>1.000.000 – 1.500.000 (96): </w:t>
+      </w:r>
+      <w:r>
+        <w:t>1036035, 1044225, 1119195, 1126125, 1167075, 1195425, 1216215, 1237005, 1276275, 1306305, 1322685, 1351350, 1354815, 1382535, 1396395, 1412775, 1426425, 1461915, 1472625, 1486485</w:t>
+      </w:r>
+    </w:p>
+    <w:p>
+      <w:r>
+        <w:t>Como validação independente, conferimos a relação mostrada na Seção 2 (decomposições = divisores ímpares) fatorando manualmente um vencedor de cada faixa: por exemplo, 45045 = 3² × 5 × 7 × 11 × 13, com (2+1)×2×2×2×2 = 48 divisores — o mesmo valor encontrado pelo algoritmo. O mesmo procedimento foi repetido para um vencedor de cada uma das sete faixas, e todos bateram.</w:t>
+      </w:r>
+    </w:p>
+    <w:p>
+      <w:r>
+        <w:t>As sete faixas juntas — a maior indo até 2.000.000 — foram resolvidas em cerca de 9,1 segundos no total.</w:t>
+      </w:r>
+    </w:p>
+    <w:p>
+      <w:pPr>
+        <w:pStyle w:val="Ttulo1"/>
+      </w:pPr>
+      <w:r>
+        <w:t>6. Conclusão</w:t>
+      </w:r>
+    </w:p>
+    <w:p>
+      <w:r>
+        <w:t>O trabalho foi resolvido a partir da relação entre decomposições e divisores ímpares que apresentamos ao modelar o problema. Essa relação permitiu trocar uma busca por sequências de números consecutivos por uma simples contagem de divisores, o que tornou o algoritmo bem mais rápido do que a primeira versão testada: com apenas 32 mil números, a versão ingênua levou quase 5 segundos, enquanto a versão final resolveu em uma fração de segundo (comparação detalhada na Seção 4).</w:t>
+      </w:r>
+    </w:p>
+    <w:p>
+      <w:r>
+        <w:t>As sete faixas pedidas pelo enunciado foram resolvidas corretamente. Os resultados foram confirmados de duas formas independentes: pelo próprio algoritmo e pela contagem manual de divisores através da fatoração dos números vencedores.</w:t>
+      </w:r>
+    </w:p>
+    <w:p>
+      <w:r>
+        <w:t>Como possível melhoria, a versão final ainda calcula a quantidade de decomposições de cada número separadamente, um por um. Um crivo, parecido com o crivo de Eratóstenes, que calculasse os divisores ímpares de todos os números de uma faixa de uma vez só, provavelmente seria ainda mais rápido, principalmente para faixas maiores que as pedidas neste trabalho. Isso não foi necessário aqui, já que os tempos ficaram na casa dos segundos, mas seria um próximo passo natural caso as faixas fossem maiores.</w:t>
+      </w:r>
+    </w:p>
+    <w:p>
+      <w:r>
+        <w:t>A versão ingênua foi mantida apenas para efeito de comparação de desempenho; ela não faz parte da solução entregue.</w:t>
       </w:r>
     </w:p>
     <w:sectPr>

</xml_diff>

<commit_message>
Adiciona o Resumo ao relatório
Escrito por último, resumindo problema, abordagem e resultados agora
que o resto do relatório está pronto.

Co-Authored-By: Claude Sonnet 5 <noreply@anthropic.com>
</commit_message>
<xml_diff>
--- a/Trabalho1/relatorio-trabalho1.docx
+++ b/Trabalho1/relatorio-trabalho1.docx
@@ -96,6 +96,24 @@
       </w:pPr>
       <w:r>
         <w:t>09 de setembro de 2026</w:t>
+      </w:r>
+    </w:p>
+    <w:p>
+      <w:pPr>
+        <w:pStyle w:val="Ttulo1"/>
+      </w:pPr>
+      <w:r>
+        <w:t>Resumo</w:t>
+      </w:r>
+    </w:p>
+    <w:p>
+      <w:r>
+        <w:t>Este trabalho trata do problema de encontrar decomposições de números inteiros, ou seja, formas de escrever um número como soma de inteiros positivos e consecutivos. O objetivo era descobrir, em sete faixas de números entre 2 e 2.000.000, qual ou quais números têm a maior quantidade de decomposições, usando uma solução recursiva.</w:t>
+      </w:r>
+    </w:p>
+    <w:p>
+      <w:r>
+        <w:t>Durante o desenvolvimento, percebemos que a quantidade de decomposições de um número é igual à quantidade de divisores ímpares desse número. Essa relação permitiu construir um algoritmo recursivo eficiente, bem mais rápido do que a primeira versão testada, que apenas testava cada possível ponto de partida da soma. As sete faixas pedidas foram resolvidas em poucos segundos, e os resultados foram conferidos de forma independente através da fatoração dos números encontrados.</w:t>
       </w:r>
     </w:p>
     <w:p>

</xml_diff>

<commit_message>
Revisão final: unifica terminologia e remove travessões restantes
"Versão inicial" e "versão ingênua" nomeavam a mesma coisa em lugares
diferentes do texto (Introdução, título 3.1, início da Seção 4) —
padroniza para "versão ingênua" em todo o relatório, que já era o
nome usado nas tabelas, no gráfico e na Conclusão. Também remove os
travessões que sobraram fora da Conclusão (Seções 2, 3, 4 e 5), que
tinham o mesmo problema apontado antes.

Co-Authored-By: Claude Sonnet 5 <noreply@anthropic.com>
</commit_message>
<xml_diff>
--- a/Trabalho1/relatorio-trabalho1.docx
+++ b/Trabalho1/relatorio-trabalho1.docx
@@ -174,7 +174,7 @@
     </w:p>
     <w:p>
       <w:r>
-        <w:t>Este relatório está organizado da seguinte forma: a Seção 2 mostra como o problema foi modelado; a Seção 3 apresenta o algoritmo utilizado, incluindo uma versão inicial mais simples que foi descartada; a Seção 4 analisa a eficiência das duas versões; a Seção 5 mostra os resultados obtidos para as sete faixas pedidas; e a Seção 6 traz as conclusões.</w:t>
+        <w:t>Este relatório está organizado da seguinte forma: a Seção 2 mostra como o problema foi modelado; a Seção 3 apresenta o algoritmo utilizado, incluindo uma versão ingênua mais simples que foi descartada; a Seção 4 analisa a eficiência das duas versões; a Seção 5 mostra os resultados obtidos para as sete faixas pedidas; e a Seção 6 traz as conclusões.</w:t>
       </w:r>
     </w:p>
     <w:p>
@@ -226,7 +226,7 @@
     </w:p>
     <w:p>
       <w:r>
-        <w:t>Ou seja, achar uma decomposição de n é o mesmo que achar uma forma de escrever 2n como o produto de dois números, k e (2a+k-1). A diferença entre esses dois números, (2a+k-1) − k = 2a−1, é sempre ímpar — o que significa que, dos dois, um é sempre par e o outro sempre ímpar.</w:t>
+        <w:t>Ou seja, achar uma decomposição de n é o mesmo que achar uma forma de escrever 2n como o produto de dois números, k e (2a+k-1). A diferença entre esses dois números, (2a+k-1) − k = 2a−1, é sempre ímpar, o que significa que, dos dois, um é sempre par e o outro sempre ímpar.</w:t>
       </w:r>
     </w:p>
     <w:p>
@@ -251,7 +251,7 @@
     </w:p>
     <w:p>
       <w:r>
-        <w:t>Isso pode ser conferido no próprio exemplo do enunciado: 15 = 3 × 5, e seus divisores são 1, 3, 5 e 15 — todos ímpares, já que 15 é ímpar. São 4 divisores, o mesmo número de decomposições mostrado no enunciado.</w:t>
+        <w:t>Isso pode ser conferido no próprio exemplo do enunciado: 15 = 3 × 5, e seus divisores são 1, 3, 5 e 15, todos ímpares porque 15 é ímpar. São 4 divisores, o mesmo número de decomposições mostrado no enunciado.</w:t>
       </w:r>
     </w:p>
     <w:p>
@@ -272,7 +272,7 @@
         <w:pStyle w:val="Ttulo2"/>
       </w:pPr>
       <w:r>
-        <w:t>3.1 Versão inicial</w:t>
+        <w:t>3.1 Versão ingênua</w:t>
       </w:r>
     </w:p>
     <w:p>
@@ -624,7 +624,7 @@
     </w:p>
     <w:p>
       <w:r>
-        <w:t>Para cada k, existe no máximo uma sequência de k termos consecutivos que soma n (a que começa em a = resto/k), então basta checar se esse a é um inteiro. Como k só precisa crescer até menorSoma ultrapassar n, a profundidade da recursão é proporcional a √n — bem menor que a versão anterior.</w:t>
+        <w:t>Para cada k, existe no máximo uma sequência de k termos consecutivos que soma n (a que começa em a = resto/k), então basta checar se esse a é um inteiro. Como k só precisa crescer até menorSoma ultrapassar n, a profundidade da recursão é proporcional a √n, bem menor que a versão anterior.</w:t>
       </w:r>
     </w:p>
     <w:p>
@@ -1260,7 +1260,7 @@
     </w:p>
     <w:p>
       <w:r>
-        <w:t>Na versão inicial, para cada n são testados até n pontos de partida diferentes, e cada um deles soma seus termos um a um até ultrapassar n. Isso faz o tempo crescer muito mais rápido que o tamanho da entrada — além de, como já mostrado na Seção 3, estourar a pilha de execução para n a partir de aproximadamente 64 mil.</w:t>
+        <w:t>Na versão ingênua, para cada n são testados até n pontos de partida diferentes, e cada um deles soma seus termos um a um até ultrapassar n. Isso faz o tempo crescer muito mais rápido que o tamanho da entrada, além de estourar a pilha de execução para n a partir de aproximadamente 64 mil, como já mostrado na Seção 3.</w:t>
       </w:r>
     </w:p>
     <w:p>
@@ -1273,7 +1273,7 @@
         <w:keepNext/>
       </w:pPr>
       <w:r>
-        <w:t>Para comparar as duas versões na prática, ambas foram executadas sobre faixas pequenas (de 500 até 32.000 — acima disso a versão ingênua estoura a pilha, como dito na Seção 3):</w:t>
+        <w:t>Para comparar as duas versões na prática, ambas foram executadas sobre faixas pequenas (de 500 até 32.000; acima disso a versão ingênua estoura a pilha, como dito na Seção 3):</w:t>
       </w:r>
     </w:p>
     <w:p>
@@ -1722,7 +1722,7 @@
       </w:pPr>
       <w:r>
         <w:lastRenderedPageBreak/>
-        <w:t>Para os tamanhos menores (500 e 1.000), o tempo da versão final é tão pequeno que passa a ser dominado por ruído de medição da própria JVM, e não pelo algoritmo em si — por isso ele não cresce de forma perfeitamente suave logo no início do gráfico abaixo.</w:t>
+        <w:t>Para os tamanhos menores (500 e 1.000), o tempo da versão final é tão pequeno que passa a ser dominado por ruído de medição da própria JVM, e não pelo algoritmo em si, por isso ele não cresce de forma perfeitamente suave logo no início do gráfico abaixo.</w:t>
       </w:r>
     </w:p>
     <w:p>
@@ -1773,7 +1773,7 @@
         <w:spacing w:before="240"/>
       </w:pPr>
       <w:r>
-        <w:t>Com a versão final, as sete faixas pedidas pelo enunciado — a maior delas indo de 1.500.000 até 2.000.000 — foram resolvidas em cerca de 9,1 segundos no total (detalhes por faixa na Seção 5), o que mostra que a solução escala bem para o tamanho real do problema.</w:t>
+        <w:t>Com a versão final, as sete faixas pedidas pelo enunciado, a maior delas indo de 1.500.000 até 2.000.000, foram resolvidas em cerca de 9,1 segundos no total (detalhes por faixa na Seção 5), o que mostra que a solução escala bem para o tamanho real do problema.</w:t>
       </w:r>
     </w:p>
     <w:p>
@@ -2416,12 +2416,12 @@
     </w:p>
     <w:p>
       <w:r>
-        <w:t>Como validação independente, conferimos a relação mostrada na Seção 2 (decomposições = divisores ímpares) fatorando manualmente um vencedor de cada faixa: por exemplo, 45045 = 3² × 5 × 7 × 11 × 13, com (2+1)×2×2×2×2 = 48 divisores — o mesmo valor encontrado pelo algoritmo. O mesmo procedimento foi repetido para um vencedor de cada uma das sete faixas, e todos bateram.</w:t>
-      </w:r>
-    </w:p>
-    <w:p>
-      <w:r>
-        <w:t>As sete faixas juntas — a maior indo até 2.000.000 — foram resolvidas em cerca de 9,1 segundos no total.</w:t>
+        <w:t>Como validação independente, conferimos a relação mostrada na Seção 2 (decomposições = divisores ímpares) fatorando manualmente um vencedor de cada faixa: por exemplo, 45045 = 3² × 5 × 7 × 11 × 13, com (2+1)×2×2×2×2 = 48 divisores, o mesmo valor encontrado pelo algoritmo. O mesmo procedimento foi repetido para um vencedor de cada uma das sete faixas, e todos bateram.</w:t>
+      </w:r>
+    </w:p>
+    <w:p>
+      <w:r>
+        <w:t>As sete faixas juntas, a maior indo até 2.000.000, foram resolvidas em cerca de 9,1 segundos no total.</w:t>
       </w:r>
     </w:p>
     <w:p>

</xml_diff>